<commit_message>
docs: update DOCX with all 13 commands + examples + consistency appendix
</commit_message>
<xml_diff>
--- a/ars-opencode-用户入门指南.docx
+++ b/ars-opencode-用户入门指南.docx
@@ -131,7 +131,7 @@
           <w:b w:val="0"/>
           <w:sz w:val="24"/>
         </w:rPr>
-        <w:t>4. 五大技能详解</w:t>
+        <w:t>4. 命令速查</w:t>
       </w:r>
     </w:p>
     <w:p>
@@ -144,7 +144,7 @@
           <w:b w:val="0"/>
           <w:sz w:val="24"/>
         </w:rPr>
-        <w:t>5. 25 种工作模式速查</w:t>
+        <w:t>5. 五大技能详解</w:t>
       </w:r>
     </w:p>
     <w:p>
@@ -157,7 +157,7 @@
           <w:b w:val="0"/>
           <w:sz w:val="24"/>
         </w:rPr>
-        <w:t>6. 管线流程概览</w:t>
+        <w:t>6. 25 种工作模式速查</w:t>
       </w:r>
     </w:p>
     <w:p>
@@ -170,7 +170,7 @@
           <w:b w:val="0"/>
           <w:sz w:val="24"/>
         </w:rPr>
-        <w:t>7. 实用技巧</w:t>
+        <w:t>7. 管线流程概览</w:t>
       </w:r>
     </w:p>
     <w:p>
@@ -183,7 +183,33 @@
           <w:b w:val="0"/>
           <w:sz w:val="24"/>
         </w:rPr>
-        <w:t>8. 常见问题</w:t>
+        <w:t>8. 实用技巧</w:t>
+      </w:r>
+    </w:p>
+    <w:p>
+      <w:pPr>
+        <w:spacing w:after="120" w:line="432" w:lineRule="auto"/>
+      </w:pPr>
+      <w:r>
+        <w:rPr>
+          <w:rFonts w:ascii="Times New Roman" w:hAnsi="Times New Roman" w:eastAsia="宋体"/>
+          <w:b w:val="0"/>
+          <w:sz w:val="24"/>
+        </w:rPr>
+        <w:t>9. 常见问题</w:t>
+      </w:r>
+    </w:p>
+    <w:p>
+      <w:pPr>
+        <w:spacing w:after="120" w:line="432" w:lineRule="auto"/>
+      </w:pPr>
+      <w:r>
+        <w:rPr>
+          <w:rFonts w:ascii="Times New Roman" w:hAnsi="Times New Roman" w:eastAsia="宋体"/>
+          <w:b w:val="0"/>
+          <w:sz w:val="24"/>
+        </w:rPr>
+        <w:t>10. 附录：内容一致性校验</w:t>
       </w:r>
     </w:p>
     <w:p>
@@ -259,7 +285,7 @@
           <w:b w:val="0"/>
           <w:sz w:val="22"/>
         </w:rPr>
-        <w:t>输入一句话研究想法，自动生成论文大纲和写作计划</w:t>
+        <w:t>输入一句话研究想法，自动生成论文大纲和写作计划（/ars-plan）</w:t>
       </w:r>
     </w:p>
     <w:p>
@@ -273,7 +299,7 @@
           <w:b w:val="0"/>
           <w:sz w:val="22"/>
         </w:rPr>
-        <w:t>输入一段文字，自动搜索并匹配 Nature/CNS 系列期刊的引用文献</w:t>
+        <w:t>输入一段文字，自动搜索并匹配 Nature/CNS 系列期刊的引用文献（/ars-lit-review）</w:t>
       </w:r>
     </w:p>
     <w:p>
@@ -287,7 +313,7 @@
           <w:b w:val="0"/>
           <w:sz w:val="22"/>
         </w:rPr>
-        <w:t>上传手稿（PDF/DOCX），获得多角度同行评审报告</w:t>
+        <w:t>上传手稿（PDF/DOCX），获得多角度同行评审报告（/ars-reviewer）</w:t>
       </w:r>
     </w:p>
     <w:p>
@@ -301,7 +327,7 @@
           <w:b w:val="0"/>
           <w:sz w:val="22"/>
         </w:rPr>
-        <w:t>对文稿进行 Nature 风格的英文润色、改写或中译英</w:t>
+        <w:t>对文稿进行 Nature 风格的英文润色、改写或中译英（/ars-revision）</w:t>
       </w:r>
     </w:p>
     <w:p>
@@ -315,7 +341,7 @@
           <w:b w:val="0"/>
           <w:sz w:val="22"/>
         </w:rPr>
-        <w:t>执行 PRISMA 系统综述流程，生成结构化综述报告</w:t>
+        <w:t>执行 PRISMA 系统综述流程，生成结构化综述报告（/ars-systematic-review）</w:t>
       </w:r>
     </w:p>
     <w:p>
@@ -329,7 +355,7 @@
           <w:b w:val="0"/>
           <w:sz w:val="22"/>
         </w:rPr>
-        <w:t>从论文 PDF 生成中英文对照阅读笔记（含图表提取）</w:t>
+        <w:t>从论文 PDF 生成中英文对照阅读笔记（含图表提取）（/ars-abstract）</w:t>
       </w:r>
     </w:p>
     <w:p>
@@ -343,7 +369,7 @@
           <w:b w:val="0"/>
           <w:sz w:val="22"/>
         </w:rPr>
-        <w:t>一键将研究数据整合为符合 Nature 要求的数据可用性声明</w:t>
+        <w:t>一键将研究数据整合为符合 Nature 要求的数据可用性声明（/ars-disclosure）</w:t>
       </w:r>
     </w:p>
     <w:p>
@@ -357,7 +383,7 @@
           <w:b w:val="0"/>
           <w:sz w:val="22"/>
         </w:rPr>
-        <w:t>生成 Nature 风格的学术报告 PPT（中文）</w:t>
+        <w:t>生成 Nature 风格的学术报告 PPT（中文）（/ars-plan）</w:t>
       </w:r>
     </w:p>
     <w:p>
@@ -876,7 +902,22 @@
           <w:i w:val="0"/>
           <w:sz w:val="22"/>
         </w:rPr>
-        <w:t>ARS 提供了 13 条预配置的快捷命令，覆盖最常见的科研场景：</w:t>
+        <w:t>ARS 提供了 13 条预配置的快捷命令，覆盖从研究、写作到评审的全流程。全部 13 条命令的详情和具体使用示例见第 4 章。</w:t>
+      </w:r>
+    </w:p>
+    <w:p>
+      <w:pPr>
+        <w:spacing w:after="120" w:line="360" w:lineRule="auto"/>
+        <w:ind w:firstLine="420"/>
+      </w:pPr>
+      <w:r>
+        <w:rPr>
+          <w:rFonts w:ascii="Times New Roman" w:hAnsi="Times New Roman" w:eastAsia="宋体"/>
+          <w:b w:val="0"/>
+          <w:i/>
+          <w:sz w:val="22"/>
+        </w:rPr>
+        <w:t>以下是各命令的快速概览：</w:t>
       </w:r>
     </w:p>
     <w:tbl>
@@ -887,14 +928,15 @@
         <w:tblLook w:firstColumn="1" w:firstRow="1" w:lastColumn="0" w:lastRow="0" w:noHBand="0" w:noVBand="1" w:val="04A0"/>
       </w:tblPr>
       <w:tblGrid>
-        <w:gridCol w:w="2882"/>
-        <w:gridCol w:w="2882"/>
-        <w:gridCol w:w="2882"/>
+        <w:gridCol w:w="2161"/>
+        <w:gridCol w:w="2161"/>
+        <w:gridCol w:w="2161"/>
+        <w:gridCol w:w="2161"/>
       </w:tblGrid>
       <w:tr>
         <w:tc>
           <w:tcPr>
-            <w:tcW w:type="dxa" w:w="1984"/>
+            <w:tcW w:type="dxa" w:w="1587"/>
             <w:shd w:val="clear" w:color="auto" w:fill="4472C4"/>
           </w:tcPr>
           <w:p>
@@ -919,7 +961,7 @@
         </w:tc>
         <w:tc>
           <w:tcPr>
-            <w:tcW w:type="dxa" w:w="2551"/>
+            <w:tcW w:type="dxa" w:w="850"/>
             <w:shd w:val="clear" w:color="auto" w:fill="4472C4"/>
           </w:tcPr>
           <w:p>
@@ -938,13 +980,13 @@
                 <w:color w:val="FFFFFF"/>
                 <w:sz w:val="20"/>
               </w:rPr>
-              <w:t>用途</w:t>
-            </w:r>
-          </w:p>
-        </w:tc>
-        <w:tc>
-          <w:tcPr>
-            <w:tcW w:type="dxa" w:w="3402"/>
+              <w:t>组别</w:t>
+            </w:r>
+          </w:p>
+        </w:tc>
+        <w:tc>
+          <w:tcPr>
+            <w:tcW w:type="dxa" w:w="1814"/>
             <w:shd w:val="clear" w:color="auto" w:fill="4472C4"/>
           </w:tcPr>
           <w:p>
@@ -963,7 +1005,32 @@
                 <w:color w:val="FFFFFF"/>
                 <w:sz w:val="20"/>
               </w:rPr>
-              <w:t>典型场景</w:t>
+              <w:t>用途</w:t>
+            </w:r>
+          </w:p>
+        </w:tc>
+        <w:tc>
+          <w:tcPr>
+            <w:tcW w:type="dxa" w:w="4252"/>
+            <w:shd w:val="clear" w:color="auto" w:fill="4472C4"/>
+          </w:tcPr>
+          <w:p>
+            <w:pPr>
+              <w:spacing w:after="40" w:before="40" w:line="240" w:lineRule="auto"/>
+            </w:pPr>
+            <w:r>
+              <w:rPr>
+                <w:color w:val="FFFFFF"/>
+              </w:rPr>
+            </w:r>
+            <w:r>
+              <w:rPr>
+                <w:rFonts w:ascii="Times New Roman" w:hAnsi="Times New Roman" w:eastAsia="宋体"/>
+                <w:b/>
+                <w:color w:val="FFFFFF"/>
+                <w:sz w:val="20"/>
+              </w:rPr>
+              <w:t>使用示例</w:t>
             </w:r>
           </w:p>
         </w:tc>
@@ -971,7 +1038,7 @@
       <w:tr>
         <w:tc>
           <w:tcPr>
-            <w:tcW w:type="dxa" w:w="1984"/>
+            <w:tcW w:type="dxa" w:w="1587"/>
           </w:tcPr>
           <w:p>
             <w:pPr>
@@ -990,7 +1057,7 @@
         </w:tc>
         <w:tc>
           <w:tcPr>
-            <w:tcW w:type="dxa" w:w="2551"/>
+            <w:tcW w:type="dxa" w:w="850"/>
           </w:tcPr>
           <w:p>
             <w:pPr>
@@ -1003,13 +1070,32 @@
                 <w:b w:val="0"/>
                 <w:sz w:val="20"/>
               </w:rPr>
+              <w:t>写作</w:t>
+            </w:r>
+          </w:p>
+        </w:tc>
+        <w:tc>
+          <w:tcPr>
+            <w:tcW w:type="dxa" w:w="1814"/>
+          </w:tcPr>
+          <w:p>
+            <w:pPr>
+              <w:spacing w:after="40" w:before="40" w:line="240" w:lineRule="auto"/>
+            </w:pPr>
+            <w:r/>
+            <w:r>
+              <w:rPr>
+                <w:rFonts w:ascii="Times New Roman" w:hAnsi="Times New Roman" w:eastAsia="宋体"/>
+                <w:b w:val="0"/>
+                <w:sz w:val="20"/>
+              </w:rPr>
               <w:t>规划论文结构</w:t>
             </w:r>
           </w:p>
         </w:tc>
         <w:tc>
           <w:tcPr>
-            <w:tcW w:type="dxa" w:w="3402"/>
+            <w:tcW w:type="dxa" w:w="4252"/>
           </w:tcPr>
           <w:p>
             <w:pPr>
@@ -1022,7 +1108,7 @@
                 <w:b w:val="0"/>
                 <w:sz w:val="20"/>
               </w:rPr>
-              <w:t>刚有一个研究想法，需要梳理框架</w:t>
+              <w:t>/ars-plan → '我要写一篇关于机器学习的综述'</w:t>
             </w:r>
           </w:p>
         </w:tc>
@@ -1030,7 +1116,7 @@
       <w:tr>
         <w:tc>
           <w:tcPr>
-            <w:tcW w:type="dxa" w:w="1984"/>
+            <w:tcW w:type="dxa" w:w="1587"/>
             <w:shd w:val="clear" w:color="auto" w:fill="D9E2F3"/>
           </w:tcPr>
           <w:p>
@@ -1044,13 +1130,13 @@
                 <w:b w:val="0"/>
                 <w:sz w:val="20"/>
               </w:rPr>
-              <w:t>/ars-lit-review "主题"</w:t>
-            </w:r>
-          </w:p>
-        </w:tc>
-        <w:tc>
-          <w:tcPr>
-            <w:tcW w:type="dxa" w:w="2551"/>
+              <w:t>/ars-abstract</w:t>
+            </w:r>
+          </w:p>
+        </w:tc>
+        <w:tc>
+          <w:tcPr>
+            <w:tcW w:type="dxa" w:w="850"/>
             <w:shd w:val="clear" w:color="auto" w:fill="D9E2F3"/>
           </w:tcPr>
           <w:p>
@@ -1064,13 +1150,13 @@
                 <w:b w:val="0"/>
                 <w:sz w:val="20"/>
               </w:rPr>
-              <w:t>快速文献综述</w:t>
-            </w:r>
-          </w:p>
-        </w:tc>
-        <w:tc>
-          <w:tcPr>
-            <w:tcW w:type="dxa" w:w="3402"/>
+              <w:t>写作</w:t>
+            </w:r>
+          </w:p>
+        </w:tc>
+        <w:tc>
+          <w:tcPr>
+            <w:tcW w:type="dxa" w:w="1814"/>
             <w:shd w:val="clear" w:color="auto" w:fill="D9E2F3"/>
           </w:tcPr>
           <w:p>
@@ -1084,7 +1170,27 @@
                 <w:b w:val="0"/>
                 <w:sz w:val="20"/>
               </w:rPr>
-              <w:t>需要了解某个方向的文献现状</w:t>
+              <w:t>撰写中英文摘要</w:t>
+            </w:r>
+          </w:p>
+        </w:tc>
+        <w:tc>
+          <w:tcPr>
+            <w:tcW w:type="dxa" w:w="4252"/>
+            <w:shd w:val="clear" w:color="auto" w:fill="D9E2F3"/>
+          </w:tcPr>
+          <w:p>
+            <w:pPr>
+              <w:spacing w:after="40" w:before="40" w:line="240" w:lineRule="auto"/>
+            </w:pPr>
+            <w:r/>
+            <w:r>
+              <w:rPr>
+                <w:rFonts w:ascii="Times New Roman" w:hAnsi="Times New Roman" w:eastAsia="宋体"/>
+                <w:b w:val="0"/>
+                <w:sz w:val="20"/>
+              </w:rPr>
+              <w:t>/ars-abstract → '这篇论文研究的是CRISPR在肿瘤免疫中的应用'</w:t>
             </w:r>
           </w:p>
         </w:tc>
@@ -1092,7 +1198,7 @@
       <w:tr>
         <w:tc>
           <w:tcPr>
-            <w:tcW w:type="dxa" w:w="1984"/>
+            <w:tcW w:type="dxa" w:w="1587"/>
           </w:tcPr>
           <w:p>
             <w:pPr>
@@ -1105,13 +1211,13 @@
                 <w:b w:val="0"/>
                 <w:sz w:val="20"/>
               </w:rPr>
-              <w:t>/ars-abstract</w:t>
-            </w:r>
-          </w:p>
-        </w:tc>
-        <w:tc>
-          <w:tcPr>
-            <w:tcW w:type="dxa" w:w="2551"/>
+              <w:t>/ars-revision</w:t>
+            </w:r>
+          </w:p>
+        </w:tc>
+        <w:tc>
+          <w:tcPr>
+            <w:tcW w:type="dxa" w:w="850"/>
           </w:tcPr>
           <w:p>
             <w:pPr>
@@ -1124,13 +1230,13 @@
                 <w:b w:val="0"/>
                 <w:sz w:val="20"/>
               </w:rPr>
-              <w:t>撰写摘要</w:t>
-            </w:r>
-          </w:p>
-        </w:tc>
-        <w:tc>
-          <w:tcPr>
-            <w:tcW w:type="dxa" w:w="3402"/>
+              <w:t>写作</w:t>
+            </w:r>
+          </w:p>
+        </w:tc>
+        <w:tc>
+          <w:tcPr>
+            <w:tcW w:type="dxa" w:w="1814"/>
           </w:tcPr>
           <w:p>
             <w:pPr>
@@ -1143,7 +1249,26 @@
                 <w:b w:val="0"/>
                 <w:sz w:val="20"/>
               </w:rPr>
-              <w:t>论文写完，需要中英文摘要</w:t>
+              <w:t>修改手稿并回复审稿意见</w:t>
+            </w:r>
+          </w:p>
+        </w:tc>
+        <w:tc>
+          <w:tcPr>
+            <w:tcW w:type="dxa" w:w="4252"/>
+          </w:tcPr>
+          <w:p>
+            <w:pPr>
+              <w:spacing w:after="40" w:before="40" w:line="240" w:lineRule="auto"/>
+            </w:pPr>
+            <w:r/>
+            <w:r>
+              <w:rPr>
+                <w:rFonts w:ascii="Times New Roman" w:hAnsi="Times New Roman" w:eastAsia="宋体"/>
+                <w:b w:val="0"/>
+                <w:sz w:val="20"/>
+              </w:rPr>
+              <w:t>/ars-revision → '以下是审稿人的3条意见和我的手稿'</w:t>
             </w:r>
           </w:p>
         </w:tc>
@@ -1151,7 +1276,7 @@
       <w:tr>
         <w:tc>
           <w:tcPr>
-            <w:tcW w:type="dxa" w:w="1984"/>
+            <w:tcW w:type="dxa" w:w="1587"/>
             <w:shd w:val="clear" w:color="auto" w:fill="D9E2F3"/>
           </w:tcPr>
           <w:p>
@@ -1165,13 +1290,13 @@
                 <w:b w:val="0"/>
                 <w:sz w:val="20"/>
               </w:rPr>
-              <w:t>/ars-review</w:t>
-            </w:r>
-          </w:p>
-        </w:tc>
-        <w:tc>
-          <w:tcPr>
-            <w:tcW w:type="dxa" w:w="2551"/>
+              <w:t>/ars-format</w:t>
+            </w:r>
+          </w:p>
+        </w:tc>
+        <w:tc>
+          <w:tcPr>
+            <w:tcW w:type="dxa" w:w="850"/>
             <w:shd w:val="clear" w:color="auto" w:fill="D9E2F3"/>
           </w:tcPr>
           <w:p>
@@ -1185,13 +1310,13 @@
                 <w:b w:val="0"/>
                 <w:sz w:val="20"/>
               </w:rPr>
-              <w:t>论文评审</w:t>
-            </w:r>
-          </w:p>
-        </w:tc>
-        <w:tc>
-          <w:tcPr>
-            <w:tcW w:type="dxa" w:w="3402"/>
+              <w:t>写作</w:t>
+            </w:r>
+          </w:p>
+        </w:tc>
+        <w:tc>
+          <w:tcPr>
+            <w:tcW w:type="dxa" w:w="1814"/>
             <w:shd w:val="clear" w:color="auto" w:fill="D9E2F3"/>
           </w:tcPr>
           <w:p>
@@ -1205,7 +1330,27 @@
                 <w:b w:val="0"/>
                 <w:sz w:val="20"/>
               </w:rPr>
-              <w:t>需要对手稿进行同行评审</w:t>
+              <w:t>引用格式转换</w:t>
+            </w:r>
+          </w:p>
+        </w:tc>
+        <w:tc>
+          <w:tcPr>
+            <w:tcW w:type="dxa" w:w="4252"/>
+            <w:shd w:val="clear" w:color="auto" w:fill="D9E2F3"/>
+          </w:tcPr>
+          <w:p>
+            <w:pPr>
+              <w:spacing w:after="40" w:before="40" w:line="240" w:lineRule="auto"/>
+            </w:pPr>
+            <w:r/>
+            <w:r>
+              <w:rPr>
+                <w:rFonts w:ascii="Times New Roman" w:hAnsi="Times New Roman" w:eastAsia="宋体"/>
+                <w:b w:val="0"/>
+                <w:sz w:val="20"/>
+              </w:rPr>
+              <w:t>/ars-format → '从APA转为IEEE格式'</w:t>
             </w:r>
           </w:p>
         </w:tc>
@@ -1213,7 +1358,7 @@
       <w:tr>
         <w:tc>
           <w:tcPr>
-            <w:tcW w:type="dxa" w:w="1984"/>
+            <w:tcW w:type="dxa" w:w="1587"/>
           </w:tcPr>
           <w:p>
             <w:pPr>
@@ -1226,13 +1371,13 @@
                 <w:b w:val="0"/>
                 <w:sz w:val="20"/>
               </w:rPr>
-              <w:t>/ars-revision</w:t>
-            </w:r>
-          </w:p>
-        </w:tc>
-        <w:tc>
-          <w:tcPr>
-            <w:tcW w:type="dxa" w:w="2551"/>
+              <w:t>/ars-disclosure</w:t>
+            </w:r>
+          </w:p>
+        </w:tc>
+        <w:tc>
+          <w:tcPr>
+            <w:tcW w:type="dxa" w:w="850"/>
           </w:tcPr>
           <w:p>
             <w:pPr>
@@ -1245,13 +1390,13 @@
                 <w:b w:val="0"/>
                 <w:sz w:val="20"/>
               </w:rPr>
-              <w:t>修改回复</w:t>
-            </w:r>
-          </w:p>
-        </w:tc>
-        <w:tc>
-          <w:tcPr>
-            <w:tcW w:type="dxa" w:w="3402"/>
+              <w:t>写作</w:t>
+            </w:r>
+          </w:p>
+        </w:tc>
+        <w:tc>
+          <w:tcPr>
+            <w:tcW w:type="dxa" w:w="1814"/>
           </w:tcPr>
           <w:p>
             <w:pPr>
@@ -1264,7 +1409,26 @@
                 <w:b w:val="0"/>
                 <w:sz w:val="20"/>
               </w:rPr>
-              <w:t>收到审稿意见，需要逐条回复</w:t>
+              <w:t>生成 AI 使用声明</w:t>
+            </w:r>
+          </w:p>
+        </w:tc>
+        <w:tc>
+          <w:tcPr>
+            <w:tcW w:type="dxa" w:w="4252"/>
+          </w:tcPr>
+          <w:p>
+            <w:pPr>
+              <w:spacing w:after="40" w:before="40" w:line="240" w:lineRule="auto"/>
+            </w:pPr>
+            <w:r/>
+            <w:r>
+              <w:rPr>
+                <w:rFonts w:ascii="Times New Roman" w:hAnsi="Times New Roman" w:eastAsia="宋体"/>
+                <w:b w:val="0"/>
+                <w:sz w:val="20"/>
+              </w:rPr>
+              <w:t>/ars-disclosure → '为Nature Communications准备AI声明'</w:t>
             </w:r>
           </w:p>
         </w:tc>
@@ -1272,7 +1436,7 @@
       <w:tr>
         <w:tc>
           <w:tcPr>
-            <w:tcW w:type="dxa" w:w="1984"/>
+            <w:tcW w:type="dxa" w:w="1587"/>
             <w:shd w:val="clear" w:color="auto" w:fill="D9E2F3"/>
           </w:tcPr>
           <w:p>
@@ -1286,13 +1450,13 @@
                 <w:b w:val="0"/>
                 <w:sz w:val="20"/>
               </w:rPr>
-              <w:t>/ars-fact-check</w:t>
-            </w:r>
-          </w:p>
-        </w:tc>
-        <w:tc>
-          <w:tcPr>
-            <w:tcW w:type="dxa" w:w="2551"/>
+              <w:t>/ars-lit-review</w:t>
+            </w:r>
+          </w:p>
+        </w:tc>
+        <w:tc>
+          <w:tcPr>
+            <w:tcW w:type="dxa" w:w="850"/>
             <w:shd w:val="clear" w:color="auto" w:fill="D9E2F3"/>
           </w:tcPr>
           <w:p>
@@ -1306,13 +1470,13 @@
                 <w:b w:val="0"/>
                 <w:sz w:val="20"/>
               </w:rPr>
-              <w:t>事实核查</w:t>
-            </w:r>
-          </w:p>
-        </w:tc>
-        <w:tc>
-          <w:tcPr>
-            <w:tcW w:type="dxa" w:w="3402"/>
+              <w:t>研究</w:t>
+            </w:r>
+          </w:p>
+        </w:tc>
+        <w:tc>
+          <w:tcPr>
+            <w:tcW w:type="dxa" w:w="1814"/>
             <w:shd w:val="clear" w:color="auto" w:fill="D9E2F3"/>
           </w:tcPr>
           <w:p>
@@ -1326,7 +1490,27 @@
                 <w:b w:val="0"/>
                 <w:sz w:val="20"/>
               </w:rPr>
-              <w:t>需要验证文稿中的学术声明</w:t>
+              <w:t>文献综述</w:t>
+            </w:r>
+          </w:p>
+        </w:tc>
+        <w:tc>
+          <w:tcPr>
+            <w:tcW w:type="dxa" w:w="4252"/>
+            <w:shd w:val="clear" w:color="auto" w:fill="D9E2F3"/>
+          </w:tcPr>
+          <w:p>
+            <w:pPr>
+              <w:spacing w:after="40" w:before="40" w:line="240" w:lineRule="auto"/>
+            </w:pPr>
+            <w:r/>
+            <w:r>
+              <w:rPr>
+                <w:rFonts w:ascii="Times New Roman" w:hAnsi="Times New Roman" w:eastAsia="宋体"/>
+                <w:b w:val="0"/>
+                <w:sz w:val="20"/>
+              </w:rPr>
+              <w:t>/ars-lit-review → '联邦学习在医疗影像中的应用'</w:t>
             </w:r>
           </w:p>
         </w:tc>
@@ -1334,7 +1518,7 @@
       <w:tr>
         <w:tc>
           <w:tcPr>
-            <w:tcW w:type="dxa" w:w="1984"/>
+            <w:tcW w:type="dxa" w:w="1587"/>
           </w:tcPr>
           <w:p>
             <w:pPr>
@@ -1347,13 +1531,13 @@
                 <w:b w:val="0"/>
                 <w:sz w:val="20"/>
               </w:rPr>
-              <w:t>/ars-format</w:t>
-            </w:r>
-          </w:p>
-        </w:tc>
-        <w:tc>
-          <w:tcPr>
-            <w:tcW w:type="dxa" w:w="2551"/>
+              <w:t>/ars-socratic</w:t>
+            </w:r>
+          </w:p>
+        </w:tc>
+        <w:tc>
+          <w:tcPr>
+            <w:tcW w:type="dxa" w:w="850"/>
           </w:tcPr>
           <w:p>
             <w:pPr>
@@ -1366,13 +1550,13 @@
                 <w:b w:val="0"/>
                 <w:sz w:val="20"/>
               </w:rPr>
-              <w:t>格式转换</w:t>
-            </w:r>
-          </w:p>
-        </w:tc>
-        <w:tc>
-          <w:tcPr>
-            <w:tcW w:type="dxa" w:w="3402"/>
+              <w:t>研究</w:t>
+            </w:r>
+          </w:p>
+        </w:tc>
+        <w:tc>
+          <w:tcPr>
+            <w:tcW w:type="dxa" w:w="1814"/>
           </w:tcPr>
           <w:p>
             <w:pPr>
@@ -1385,7 +1569,26 @@
                 <w:b w:val="0"/>
                 <w:sz w:val="20"/>
               </w:rPr>
-              <w:t>需要在 APA/MLA/Chicago 等格式间切换</w:t>
+              <w:t>苏格拉底式研究引导</w:t>
+            </w:r>
+          </w:p>
+        </w:tc>
+        <w:tc>
+          <w:tcPr>
+            <w:tcW w:type="dxa" w:w="4252"/>
+          </w:tcPr>
+          <w:p>
+            <w:pPr>
+              <w:spacing w:after="40" w:before="40" w:line="240" w:lineRule="auto"/>
+            </w:pPr>
+            <w:r/>
+            <w:r>
+              <w:rPr>
+                <w:rFonts w:ascii="Times New Roman" w:hAnsi="Times New Roman" w:eastAsia="宋体"/>
+                <w:b w:val="0"/>
+                <w:sz w:val="20"/>
+              </w:rPr>
+              <w:t>/ars-socratic → '帮我梳理博士论文方向'</w:t>
             </w:r>
           </w:p>
         </w:tc>
@@ -1393,7 +1596,7 @@
       <w:tr>
         <w:tc>
           <w:tcPr>
-            <w:tcW w:type="dxa" w:w="1984"/>
+            <w:tcW w:type="dxa" w:w="1587"/>
             <w:shd w:val="clear" w:color="auto" w:fill="D9E2F3"/>
           </w:tcPr>
           <w:p>
@@ -1407,13 +1610,13 @@
                 <w:b w:val="0"/>
                 <w:sz w:val="20"/>
               </w:rPr>
-              <w:t>/ars-disclosure</w:t>
-            </w:r>
-          </w:p>
-        </w:tc>
-        <w:tc>
-          <w:tcPr>
-            <w:tcW w:type="dxa" w:w="2551"/>
+              <w:t>/ars-systematic-review</w:t>
+            </w:r>
+          </w:p>
+        </w:tc>
+        <w:tc>
+          <w:tcPr>
+            <w:tcW w:type="dxa" w:w="850"/>
             <w:shd w:val="clear" w:color="auto" w:fill="D9E2F3"/>
           </w:tcPr>
           <w:p>
@@ -1427,13 +1630,13 @@
                 <w:b w:val="0"/>
                 <w:sz w:val="20"/>
               </w:rPr>
-              <w:t>AI 使用声明</w:t>
-            </w:r>
-          </w:p>
-        </w:tc>
-        <w:tc>
-          <w:tcPr>
-            <w:tcW w:type="dxa" w:w="3402"/>
+              <w:t>研究</w:t>
+            </w:r>
+          </w:p>
+        </w:tc>
+        <w:tc>
+          <w:tcPr>
+            <w:tcW w:type="dxa" w:w="1814"/>
             <w:shd w:val="clear" w:color="auto" w:fill="D9E2F3"/>
           </w:tcPr>
           <w:p>
@@ -1447,7 +1650,27 @@
                 <w:b w:val="0"/>
                 <w:sz w:val="20"/>
               </w:rPr>
-              <w:t>生成投稿所需的 AI 辅助声明</w:t>
+              <w:t>PRISMA 系统综述</w:t>
+            </w:r>
+          </w:p>
+        </w:tc>
+        <w:tc>
+          <w:tcPr>
+            <w:tcW w:type="dxa" w:w="4252"/>
+            <w:shd w:val="clear" w:color="auto" w:fill="D9E2F3"/>
+          </w:tcPr>
+          <w:p>
+            <w:pPr>
+              <w:spacing w:after="40" w:before="40" w:line="240" w:lineRule="auto"/>
+            </w:pPr>
+            <w:r/>
+            <w:r>
+              <w:rPr>
+                <w:rFonts w:ascii="Times New Roman" w:hAnsi="Times New Roman" w:eastAsia="宋体"/>
+                <w:b w:val="0"/>
+                <w:sz w:val="20"/>
+              </w:rPr>
+              <w:t>/ars-systematic-review → 'AI辅助药物发现的系统综述'</w:t>
             </w:r>
           </w:p>
         </w:tc>
@@ -1455,7 +1678,7 @@
       <w:tr>
         <w:tc>
           <w:tcPr>
-            <w:tcW w:type="dxa" w:w="1984"/>
+            <w:tcW w:type="dxa" w:w="1587"/>
           </w:tcPr>
           <w:p>
             <w:pPr>
@@ -1468,13 +1691,333 @@
                 <w:b w:val="0"/>
                 <w:sz w:val="20"/>
               </w:rPr>
+              <w:t>/ars-fact-check</w:t>
+            </w:r>
+          </w:p>
+        </w:tc>
+        <w:tc>
+          <w:tcPr>
+            <w:tcW w:type="dxa" w:w="850"/>
+          </w:tcPr>
+          <w:p>
+            <w:pPr>
+              <w:spacing w:after="40" w:before="40" w:line="240" w:lineRule="auto"/>
+            </w:pPr>
+            <w:r/>
+            <w:r>
+              <w:rPr>
+                <w:rFonts w:ascii="Times New Roman" w:hAnsi="Times New Roman" w:eastAsia="宋体"/>
+                <w:b w:val="0"/>
+                <w:sz w:val="20"/>
+              </w:rPr>
+              <w:t>研究</w:t>
+            </w:r>
+          </w:p>
+        </w:tc>
+        <w:tc>
+          <w:tcPr>
+            <w:tcW w:type="dxa" w:w="1814"/>
+          </w:tcPr>
+          <w:p>
+            <w:pPr>
+              <w:spacing w:after="40" w:before="40" w:line="240" w:lineRule="auto"/>
+            </w:pPr>
+            <w:r/>
+            <w:r>
+              <w:rPr>
+                <w:rFonts w:ascii="Times New Roman" w:hAnsi="Times New Roman" w:eastAsia="宋体"/>
+                <w:b w:val="0"/>
+                <w:sz w:val="20"/>
+              </w:rPr>
+              <w:t>事实核查</w:t>
+            </w:r>
+          </w:p>
+        </w:tc>
+        <w:tc>
+          <w:tcPr>
+            <w:tcW w:type="dxa" w:w="4252"/>
+          </w:tcPr>
+          <w:p>
+            <w:pPr>
+              <w:spacing w:after="40" w:before="40" w:line="240" w:lineRule="auto"/>
+            </w:pPr>
+            <w:r/>
+            <w:r>
+              <w:rPr>
+                <w:rFonts w:ascii="Times New Roman" w:hAnsi="Times New Roman" w:eastAsia="宋体"/>
+                <w:b w:val="0"/>
+                <w:sz w:val="20"/>
+              </w:rPr>
+              <w:t>/ars-fact-check → '验证干细胞治疗的5条声明'</w:t>
+            </w:r>
+          </w:p>
+        </w:tc>
+      </w:tr>
+      <w:tr>
+        <w:tc>
+          <w:tcPr>
+            <w:tcW w:type="dxa" w:w="1587"/>
+            <w:shd w:val="clear" w:color="auto" w:fill="D9E2F3"/>
+          </w:tcPr>
+          <w:p>
+            <w:pPr>
+              <w:spacing w:after="40" w:before="40" w:line="240" w:lineRule="auto"/>
+            </w:pPr>
+            <w:r/>
+            <w:r>
+              <w:rPr>
+                <w:rFonts w:ascii="Times New Roman" w:hAnsi="Times New Roman" w:eastAsia="宋体"/>
+                <w:b w:val="0"/>
+                <w:sz w:val="20"/>
+              </w:rPr>
+              <w:t>/ars-review</w:t>
+            </w:r>
+          </w:p>
+        </w:tc>
+        <w:tc>
+          <w:tcPr>
+            <w:tcW w:type="dxa" w:w="850"/>
+            <w:shd w:val="clear" w:color="auto" w:fill="D9E2F3"/>
+          </w:tcPr>
+          <w:p>
+            <w:pPr>
+              <w:spacing w:after="40" w:before="40" w:line="240" w:lineRule="auto"/>
+            </w:pPr>
+            <w:r/>
+            <w:r>
+              <w:rPr>
+                <w:rFonts w:ascii="Times New Roman" w:hAnsi="Times New Roman" w:eastAsia="宋体"/>
+                <w:b w:val="0"/>
+                <w:sz w:val="20"/>
+              </w:rPr>
+              <w:t>评审</w:t>
+            </w:r>
+          </w:p>
+        </w:tc>
+        <w:tc>
+          <w:tcPr>
+            <w:tcW w:type="dxa" w:w="1814"/>
+            <w:shd w:val="clear" w:color="auto" w:fill="D9E2F3"/>
+          </w:tcPr>
+          <w:p>
+            <w:pPr>
+              <w:spacing w:after="40" w:before="40" w:line="240" w:lineRule="auto"/>
+            </w:pPr>
+            <w:r/>
+            <w:r>
+              <w:rPr>
+                <w:rFonts w:ascii="Times New Roman" w:hAnsi="Times New Roman" w:eastAsia="宋体"/>
+                <w:b w:val="0"/>
+                <w:sz w:val="20"/>
+              </w:rPr>
+              <w:t>研究质量评估</w:t>
+            </w:r>
+          </w:p>
+        </w:tc>
+        <w:tc>
+          <w:tcPr>
+            <w:tcW w:type="dxa" w:w="4252"/>
+            <w:shd w:val="clear" w:color="auto" w:fill="D9E2F3"/>
+          </w:tcPr>
+          <w:p>
+            <w:pPr>
+              <w:spacing w:after="40" w:before="40" w:line="240" w:lineRule="auto"/>
+            </w:pPr>
+            <w:r/>
+            <w:r>
+              <w:rPr>
+                <w:rFonts w:ascii="Times New Roman" w:hAnsi="Times New Roman" w:eastAsia="宋体"/>
+                <w:b w:val="0"/>
+                <w:sz w:val="20"/>
+              </w:rPr>
+              <w:t>/ars-review → '评估气候变化研究的可靠性'</w:t>
+            </w:r>
+          </w:p>
+        </w:tc>
+      </w:tr>
+      <w:tr>
+        <w:tc>
+          <w:tcPr>
+            <w:tcW w:type="dxa" w:w="1587"/>
+          </w:tcPr>
+          <w:p>
+            <w:pPr>
+              <w:spacing w:after="40" w:before="40" w:line="240" w:lineRule="auto"/>
+            </w:pPr>
+            <w:r/>
+            <w:r>
+              <w:rPr>
+                <w:rFonts w:ascii="Times New Roman" w:hAnsi="Times New Roman" w:eastAsia="宋体"/>
+                <w:b w:val="0"/>
+                <w:sz w:val="20"/>
+              </w:rPr>
+              <w:t>/ars-reviewer</w:t>
+            </w:r>
+          </w:p>
+        </w:tc>
+        <w:tc>
+          <w:tcPr>
+            <w:tcW w:type="dxa" w:w="850"/>
+          </w:tcPr>
+          <w:p>
+            <w:pPr>
+              <w:spacing w:after="40" w:before="40" w:line="240" w:lineRule="auto"/>
+            </w:pPr>
+            <w:r/>
+            <w:r>
+              <w:rPr>
+                <w:rFonts w:ascii="Times New Roman" w:hAnsi="Times New Roman" w:eastAsia="宋体"/>
+                <w:b w:val="0"/>
+                <w:sz w:val="20"/>
+              </w:rPr>
+              <w:t>评审</w:t>
+            </w:r>
+          </w:p>
+        </w:tc>
+        <w:tc>
+          <w:tcPr>
+            <w:tcW w:type="dxa" w:w="1814"/>
+          </w:tcPr>
+          <w:p>
+            <w:pPr>
+              <w:spacing w:after="40" w:before="40" w:line="240" w:lineRule="auto"/>
+            </w:pPr>
+            <w:r/>
+            <w:r>
+              <w:rPr>
+                <w:rFonts w:ascii="Times New Roman" w:hAnsi="Times New Roman" w:eastAsia="宋体"/>
+                <w:b w:val="0"/>
+                <w:sz w:val="20"/>
+              </w:rPr>
+              <w:t>完整多视角同行评审</w:t>
+            </w:r>
+          </w:p>
+        </w:tc>
+        <w:tc>
+          <w:tcPr>
+            <w:tcW w:type="dxa" w:w="4252"/>
+          </w:tcPr>
+          <w:p>
+            <w:pPr>
+              <w:spacing w:after="40" w:before="40" w:line="240" w:lineRule="auto"/>
+            </w:pPr>
+            <w:r/>
+            <w:r>
+              <w:rPr>
+                <w:rFonts w:ascii="Times New Roman" w:hAnsi="Times New Roman" w:eastAsia="宋体"/>
+                <w:b w:val="0"/>
+                <w:sz w:val="20"/>
+              </w:rPr>
+              <w:t>/ars-reviewer → '评审量子计算手稿'</w:t>
+            </w:r>
+          </w:p>
+        </w:tc>
+      </w:tr>
+      <w:tr>
+        <w:tc>
+          <w:tcPr>
+            <w:tcW w:type="dxa" w:w="1587"/>
+            <w:shd w:val="clear" w:color="auto" w:fill="D9E2F3"/>
+          </w:tcPr>
+          <w:p>
+            <w:pPr>
+              <w:spacing w:after="40" w:before="40" w:line="240" w:lineRule="auto"/>
+            </w:pPr>
+            <w:r/>
+            <w:r>
+              <w:rPr>
+                <w:rFonts w:ascii="Times New Roman" w:hAnsi="Times New Roman" w:eastAsia="宋体"/>
+                <w:b w:val="0"/>
+                <w:sz w:val="20"/>
+              </w:rPr>
+              <w:t>/ars-calibrate</w:t>
+            </w:r>
+          </w:p>
+        </w:tc>
+        <w:tc>
+          <w:tcPr>
+            <w:tcW w:type="dxa" w:w="850"/>
+            <w:shd w:val="clear" w:color="auto" w:fill="D9E2F3"/>
+          </w:tcPr>
+          <w:p>
+            <w:pPr>
+              <w:spacing w:after="40" w:before="40" w:line="240" w:lineRule="auto"/>
+            </w:pPr>
+            <w:r/>
+            <w:r>
+              <w:rPr>
+                <w:rFonts w:ascii="Times New Roman" w:hAnsi="Times New Roman" w:eastAsia="宋体"/>
+                <w:b w:val="0"/>
+                <w:sz w:val="20"/>
+              </w:rPr>
+              <w:t>评审</w:t>
+            </w:r>
+          </w:p>
+        </w:tc>
+        <w:tc>
+          <w:tcPr>
+            <w:tcW w:type="dxa" w:w="1814"/>
+            <w:shd w:val="clear" w:color="auto" w:fill="D9E2F3"/>
+          </w:tcPr>
+          <w:p>
+            <w:pPr>
+              <w:spacing w:after="40" w:before="40" w:line="240" w:lineRule="auto"/>
+            </w:pPr>
+            <w:r/>
+            <w:r>
+              <w:rPr>
+                <w:rFonts w:ascii="Times New Roman" w:hAnsi="Times New Roman" w:eastAsia="宋体"/>
+                <w:b w:val="0"/>
+                <w:sz w:val="20"/>
+              </w:rPr>
+              <w:t>校准评审标准</w:t>
+            </w:r>
+          </w:p>
+        </w:tc>
+        <w:tc>
+          <w:tcPr>
+            <w:tcW w:type="dxa" w:w="4252"/>
+            <w:shd w:val="clear" w:color="auto" w:fill="D9E2F3"/>
+          </w:tcPr>
+          <w:p>
+            <w:pPr>
+              <w:spacing w:after="40" w:before="40" w:line="240" w:lineRule="auto"/>
+            </w:pPr>
+            <w:r/>
+            <w:r>
+              <w:rPr>
+                <w:rFonts w:ascii="Times New Roman" w:hAnsi="Times New Roman" w:eastAsia="宋体"/>
+                <w:b w:val="0"/>
+                <w:sz w:val="20"/>
+              </w:rPr>
+              <w:t>/ars-calibrate → '用金标准数据集校准'</w:t>
+            </w:r>
+          </w:p>
+        </w:tc>
+      </w:tr>
+      <w:tr>
+        <w:tc>
+          <w:tcPr>
+            <w:tcW w:type="dxa" w:w="1587"/>
+          </w:tcPr>
+          <w:p>
+            <w:pPr>
+              <w:spacing w:after="40" w:before="40" w:line="240" w:lineRule="auto"/>
+            </w:pPr>
+            <w:r/>
+            <w:r>
+              <w:rPr>
+                <w:rFonts w:ascii="Times New Roman" w:hAnsi="Times New Roman" w:eastAsia="宋体"/>
+                <w:b w:val="0"/>
+                <w:sz w:val="20"/>
+              </w:rPr>
               <w:t>/ars-full</w:t>
             </w:r>
           </w:p>
         </w:tc>
         <w:tc>
           <w:tcPr>
-            <w:tcW w:type="dxa" w:w="2551"/>
+            <w:tcW w:type="dxa" w:w="850"/>
           </w:tcPr>
           <w:p>
             <w:pPr>
@@ -1487,13 +2030,13 @@
                 <w:b w:val="0"/>
                 <w:sz w:val="20"/>
               </w:rPr>
-              <w:t>完整管线</w:t>
-            </w:r>
-          </w:p>
-        </w:tc>
-        <w:tc>
-          <w:tcPr>
-            <w:tcW w:type="dxa" w:w="3402"/>
+              <w:t>管线</w:t>
+            </w:r>
+          </w:p>
+        </w:tc>
+        <w:tc>
+          <w:tcPr>
+            <w:tcW w:type="dxa" w:w="1814"/>
           </w:tcPr>
           <w:p>
             <w:pPr>
@@ -1506,7 +2049,26 @@
                 <w:b w:val="0"/>
                 <w:sz w:val="20"/>
               </w:rPr>
-              <w:t>从研究到定稿的端到端流程</w:t>
+              <w:t>端到端 10 阶段管线</w:t>
+            </w:r>
+          </w:p>
+        </w:tc>
+        <w:tc>
+          <w:tcPr>
+            <w:tcW w:type="dxa" w:w="4252"/>
+          </w:tcPr>
+          <w:p>
+            <w:pPr>
+              <w:spacing w:after="40" w:before="40" w:line="240" w:lineRule="auto"/>
+            </w:pPr>
+            <w:r/>
+            <w:r>
+              <w:rPr>
+                <w:rFonts w:ascii="Times New Roman" w:hAnsi="Times New Roman" w:eastAsia="宋体"/>
+                <w:b w:val="0"/>
+                <w:sz w:val="20"/>
+              </w:rPr>
+              <w:t>/ars-full → '从零写一篇mRNA疫苗论文'</w:t>
             </w:r>
           </w:p>
         </w:tc>
@@ -1607,7 +2169,1469 @@
           <w:b/>
           <w:sz w:val="32"/>
         </w:rPr>
-        <w:t>4. 五大技能详解</w:t>
+        <w:t>4. 命令速查</w:t>
+      </w:r>
+    </w:p>
+    <w:p>
+      <w:pPr>
+        <w:spacing w:after="120" w:line="360" w:lineRule="auto"/>
+        <w:ind w:firstLine="420"/>
+      </w:pPr>
+      <w:r>
+        <w:rPr>
+          <w:rFonts w:ascii="Times New Roman" w:hAnsi="Times New Roman" w:eastAsia="宋体"/>
+          <w:b w:val="0"/>
+          <w:i w:val="0"/>
+          <w:sz w:val="22"/>
+        </w:rPr>
+        <w:t>ARS 共提供 13 条命令，按功能分为四组：研究、写作、评审、管线。每个命令都对应一个 ARS 技能的工作模式。下表列出全部命令及其详细说明和具体使用示例。</w:t>
+      </w:r>
+    </w:p>
+    <w:tbl>
+      <w:tblPr>
+        <w:tblStyle w:val="TableGrid"/>
+        <w:tblW w:type="auto" w:w="0"/>
+        <w:jc w:val="center"/>
+        <w:tblLook w:firstColumn="1" w:firstRow="1" w:lastColumn="0" w:lastRow="0" w:noHBand="0" w:noVBand="1" w:val="04A0"/>
+      </w:tblPr>
+      <w:tblGrid>
+        <w:gridCol w:w="1729"/>
+        <w:gridCol w:w="1729"/>
+        <w:gridCol w:w="1729"/>
+        <w:gridCol w:w="1729"/>
+        <w:gridCol w:w="1729"/>
+      </w:tblGrid>
+      <w:tr>
+        <w:tc>
+          <w:tcPr>
+            <w:tcW w:type="dxa" w:w="1304"/>
+            <w:shd w:val="clear" w:color="auto" w:fill="4472C4"/>
+          </w:tcPr>
+          <w:p>
+            <w:pPr>
+              <w:spacing w:after="40" w:before="40" w:line="240" w:lineRule="auto"/>
+            </w:pPr>
+            <w:r>
+              <w:rPr>
+                <w:color w:val="FFFFFF"/>
+              </w:rPr>
+            </w:r>
+            <w:r>
+              <w:rPr>
+                <w:rFonts w:ascii="Times New Roman" w:hAnsi="Times New Roman" w:eastAsia="宋体"/>
+                <w:b/>
+                <w:color w:val="FFFFFF"/>
+                <w:sz w:val="20"/>
+              </w:rPr>
+              <w:t>命令</w:t>
+            </w:r>
+          </w:p>
+        </w:tc>
+        <w:tc>
+          <w:tcPr>
+            <w:tcW w:type="dxa" w:w="737"/>
+            <w:shd w:val="clear" w:color="auto" w:fill="4472C4"/>
+          </w:tcPr>
+          <w:p>
+            <w:pPr>
+              <w:spacing w:after="40" w:before="40" w:line="240" w:lineRule="auto"/>
+            </w:pPr>
+            <w:r>
+              <w:rPr>
+                <w:color w:val="FFFFFF"/>
+              </w:rPr>
+            </w:r>
+            <w:r>
+              <w:rPr>
+                <w:rFonts w:ascii="Times New Roman" w:hAnsi="Times New Roman" w:eastAsia="宋体"/>
+                <w:b/>
+                <w:color w:val="FFFFFF"/>
+                <w:sz w:val="20"/>
+              </w:rPr>
+              <w:t>组别</w:t>
+            </w:r>
+          </w:p>
+        </w:tc>
+        <w:tc>
+          <w:tcPr>
+            <w:tcW w:type="dxa" w:w="1984"/>
+            <w:shd w:val="clear" w:color="auto" w:fill="4472C4"/>
+          </w:tcPr>
+          <w:p>
+            <w:pPr>
+              <w:spacing w:after="40" w:before="40" w:line="240" w:lineRule="auto"/>
+            </w:pPr>
+            <w:r>
+              <w:rPr>
+                <w:color w:val="FFFFFF"/>
+              </w:rPr>
+            </w:r>
+            <w:r>
+              <w:rPr>
+                <w:rFonts w:ascii="Times New Roman" w:hAnsi="Times New Roman" w:eastAsia="宋体"/>
+                <w:b/>
+                <w:color w:val="FFFFFF"/>
+                <w:sz w:val="20"/>
+              </w:rPr>
+              <w:t>用途</w:t>
+            </w:r>
+          </w:p>
+        </w:tc>
+        <w:tc>
+          <w:tcPr>
+            <w:tcW w:type="dxa" w:w="1417"/>
+            <w:shd w:val="clear" w:color="auto" w:fill="4472C4"/>
+          </w:tcPr>
+          <w:p>
+            <w:pPr>
+              <w:spacing w:after="40" w:before="40" w:line="240" w:lineRule="auto"/>
+            </w:pPr>
+            <w:r>
+              <w:rPr>
+                <w:color w:val="FFFFFF"/>
+              </w:rPr>
+            </w:r>
+            <w:r>
+              <w:rPr>
+                <w:rFonts w:ascii="Times New Roman" w:hAnsi="Times New Roman" w:eastAsia="宋体"/>
+                <w:b/>
+                <w:color w:val="FFFFFF"/>
+                <w:sz w:val="20"/>
+              </w:rPr>
+              <w:t>加载的技能</w:t>
+            </w:r>
+          </w:p>
+        </w:tc>
+        <w:tc>
+          <w:tcPr>
+            <w:tcW w:type="dxa" w:w="3118"/>
+            <w:shd w:val="clear" w:color="auto" w:fill="4472C4"/>
+          </w:tcPr>
+          <w:p>
+            <w:pPr>
+              <w:spacing w:after="40" w:before="40" w:line="240" w:lineRule="auto"/>
+            </w:pPr>
+            <w:r>
+              <w:rPr>
+                <w:color w:val="FFFFFF"/>
+              </w:rPr>
+            </w:r>
+            <w:r>
+              <w:rPr>
+                <w:rFonts w:ascii="Times New Roman" w:hAnsi="Times New Roman" w:eastAsia="宋体"/>
+                <w:b/>
+                <w:color w:val="FFFFFF"/>
+                <w:sz w:val="20"/>
+              </w:rPr>
+              <w:t>使用示例</w:t>
+            </w:r>
+          </w:p>
+        </w:tc>
+      </w:tr>
+      <w:tr>
+        <w:tc>
+          <w:tcPr>
+            <w:tcW w:type="dxa" w:w="1304"/>
+          </w:tcPr>
+          <w:p>
+            <w:pPr>
+              <w:spacing w:after="40" w:before="40" w:line="240" w:lineRule="auto"/>
+            </w:pPr>
+            <w:r/>
+            <w:r>
+              <w:rPr>
+                <w:rFonts w:ascii="Times New Roman" w:hAnsi="Times New Roman" w:eastAsia="宋体"/>
+                <w:b w:val="0"/>
+                <w:sz w:val="20"/>
+              </w:rPr>
+              <w:t>/ars-plan</w:t>
+            </w:r>
+          </w:p>
+        </w:tc>
+        <w:tc>
+          <w:tcPr>
+            <w:tcW w:type="dxa" w:w="737"/>
+          </w:tcPr>
+          <w:p>
+            <w:pPr>
+              <w:spacing w:after="40" w:before="40" w:line="240" w:lineRule="auto"/>
+            </w:pPr>
+            <w:r/>
+            <w:r>
+              <w:rPr>
+                <w:rFonts w:ascii="Times New Roman" w:hAnsi="Times New Roman" w:eastAsia="宋体"/>
+                <w:b w:val="0"/>
+                <w:sz w:val="20"/>
+              </w:rPr>
+              <w:t>写作</w:t>
+            </w:r>
+          </w:p>
+        </w:tc>
+        <w:tc>
+          <w:tcPr>
+            <w:tcW w:type="dxa" w:w="1984"/>
+          </w:tcPr>
+          <w:p>
+            <w:pPr>
+              <w:spacing w:after="40" w:before="40" w:line="240" w:lineRule="auto"/>
+            </w:pPr>
+            <w:r/>
+            <w:r>
+              <w:rPr>
+                <w:rFonts w:ascii="Times New Roman" w:hAnsi="Times New Roman" w:eastAsia="宋体"/>
+                <w:b w:val="0"/>
+                <w:sz w:val="20"/>
+              </w:rPr>
+              <w:t>通过苏格拉底式对话规划论文结构</w:t>
+            </w:r>
+          </w:p>
+        </w:tc>
+        <w:tc>
+          <w:tcPr>
+            <w:tcW w:type="dxa" w:w="1417"/>
+          </w:tcPr>
+          <w:p>
+            <w:pPr>
+              <w:spacing w:after="40" w:before="40" w:line="240" w:lineRule="auto"/>
+            </w:pPr>
+            <w:r/>
+            <w:r>
+              <w:rPr>
+                <w:rFonts w:ascii="Times New Roman" w:hAnsi="Times New Roman" w:eastAsia="宋体"/>
+                <w:b w:val="0"/>
+                <w:sz w:val="20"/>
+              </w:rPr>
+              <w:t>ars-academic-paper</w:t>
+            </w:r>
+          </w:p>
+        </w:tc>
+        <w:tc>
+          <w:tcPr>
+            <w:tcW w:type="dxa" w:w="3118"/>
+          </w:tcPr>
+          <w:p>
+            <w:pPr>
+              <w:spacing w:after="40" w:before="40" w:line="240" w:lineRule="auto"/>
+            </w:pPr>
+            <w:r/>
+            <w:r>
+              <w:rPr>
+                <w:rFonts w:ascii="Times New Roman" w:hAnsi="Times New Roman" w:eastAsia="宋体"/>
+                <w:b w:val="0"/>
+                <w:sz w:val="20"/>
+              </w:rPr>
+              <w:t>/ars-plan → '我要写一篇关于机器学习在药物发现中应用的综述，帮我规划结构'</w:t>
+            </w:r>
+          </w:p>
+        </w:tc>
+      </w:tr>
+      <w:tr>
+        <w:tc>
+          <w:tcPr>
+            <w:tcW w:type="dxa" w:w="1304"/>
+            <w:shd w:val="clear" w:color="auto" w:fill="D9E2F3"/>
+          </w:tcPr>
+          <w:p>
+            <w:pPr>
+              <w:spacing w:after="40" w:before="40" w:line="240" w:lineRule="auto"/>
+            </w:pPr>
+            <w:r/>
+            <w:r>
+              <w:rPr>
+                <w:rFonts w:ascii="Times New Roman" w:hAnsi="Times New Roman" w:eastAsia="宋体"/>
+                <w:b w:val="0"/>
+                <w:sz w:val="20"/>
+              </w:rPr>
+              <w:t>/ars-abstract</w:t>
+            </w:r>
+          </w:p>
+        </w:tc>
+        <w:tc>
+          <w:tcPr>
+            <w:tcW w:type="dxa" w:w="737"/>
+            <w:shd w:val="clear" w:color="auto" w:fill="D9E2F3"/>
+          </w:tcPr>
+          <w:p>
+            <w:pPr>
+              <w:spacing w:after="40" w:before="40" w:line="240" w:lineRule="auto"/>
+            </w:pPr>
+            <w:r/>
+            <w:r>
+              <w:rPr>
+                <w:rFonts w:ascii="Times New Roman" w:hAnsi="Times New Roman" w:eastAsia="宋体"/>
+                <w:b w:val="0"/>
+                <w:sz w:val="20"/>
+              </w:rPr>
+              <w:t>写作</w:t>
+            </w:r>
+          </w:p>
+        </w:tc>
+        <w:tc>
+          <w:tcPr>
+            <w:tcW w:type="dxa" w:w="1984"/>
+            <w:shd w:val="clear" w:color="auto" w:fill="D9E2F3"/>
+          </w:tcPr>
+          <w:p>
+            <w:pPr>
+              <w:spacing w:after="40" w:before="40" w:line="240" w:lineRule="auto"/>
+            </w:pPr>
+            <w:r/>
+            <w:r>
+              <w:rPr>
+                <w:rFonts w:ascii="Times New Roman" w:hAnsi="Times New Roman" w:eastAsia="宋体"/>
+                <w:b w:val="0"/>
+                <w:sz w:val="20"/>
+              </w:rPr>
+              <w:t>为论文撰写中英文摘要</w:t>
+            </w:r>
+          </w:p>
+        </w:tc>
+        <w:tc>
+          <w:tcPr>
+            <w:tcW w:type="dxa" w:w="1417"/>
+            <w:shd w:val="clear" w:color="auto" w:fill="D9E2F3"/>
+          </w:tcPr>
+          <w:p>
+            <w:pPr>
+              <w:spacing w:after="40" w:before="40" w:line="240" w:lineRule="auto"/>
+            </w:pPr>
+            <w:r/>
+            <w:r>
+              <w:rPr>
+                <w:rFonts w:ascii="Times New Roman" w:hAnsi="Times New Roman" w:eastAsia="宋体"/>
+                <w:b w:val="0"/>
+                <w:sz w:val="20"/>
+              </w:rPr>
+              <w:t>ars-academic-paper</w:t>
+            </w:r>
+          </w:p>
+        </w:tc>
+        <w:tc>
+          <w:tcPr>
+            <w:tcW w:type="dxa" w:w="3118"/>
+            <w:shd w:val="clear" w:color="auto" w:fill="D9E2F3"/>
+          </w:tcPr>
+          <w:p>
+            <w:pPr>
+              <w:spacing w:after="40" w:before="40" w:line="240" w:lineRule="auto"/>
+            </w:pPr>
+            <w:r/>
+            <w:r>
+              <w:rPr>
+                <w:rFonts w:ascii="Times New Roman" w:hAnsi="Times New Roman" w:eastAsia="宋体"/>
+                <w:b w:val="0"/>
+                <w:sz w:val="20"/>
+              </w:rPr>
+              <w:t>/ars-abstract → '这篇论文研究的是CRISPR-Cas9在肿瘤免疫治疗中的应用，帮我写中英文摘要'</w:t>
+            </w:r>
+          </w:p>
+        </w:tc>
+      </w:tr>
+      <w:tr>
+        <w:tc>
+          <w:tcPr>
+            <w:tcW w:type="dxa" w:w="1304"/>
+          </w:tcPr>
+          <w:p>
+            <w:pPr>
+              <w:spacing w:after="40" w:before="40" w:line="240" w:lineRule="auto"/>
+            </w:pPr>
+            <w:r/>
+            <w:r>
+              <w:rPr>
+                <w:rFonts w:ascii="Times New Roman" w:hAnsi="Times New Roman" w:eastAsia="宋体"/>
+                <w:b w:val="0"/>
+                <w:sz w:val="20"/>
+              </w:rPr>
+              <w:t>/ars-revision</w:t>
+            </w:r>
+          </w:p>
+        </w:tc>
+        <w:tc>
+          <w:tcPr>
+            <w:tcW w:type="dxa" w:w="737"/>
+          </w:tcPr>
+          <w:p>
+            <w:pPr>
+              <w:spacing w:after="40" w:before="40" w:line="240" w:lineRule="auto"/>
+            </w:pPr>
+            <w:r/>
+            <w:r>
+              <w:rPr>
+                <w:rFonts w:ascii="Times New Roman" w:hAnsi="Times New Roman" w:eastAsia="宋体"/>
+                <w:b w:val="0"/>
+                <w:sz w:val="20"/>
+              </w:rPr>
+              <w:t>写作</w:t>
+            </w:r>
+          </w:p>
+        </w:tc>
+        <w:tc>
+          <w:tcPr>
+            <w:tcW w:type="dxa" w:w="1984"/>
+          </w:tcPr>
+          <w:p>
+            <w:pPr>
+              <w:spacing w:after="40" w:before="40" w:line="240" w:lineRule="auto"/>
+            </w:pPr>
+            <w:r/>
+            <w:r>
+              <w:rPr>
+                <w:rFonts w:ascii="Times New Roman" w:hAnsi="Times New Roman" w:eastAsia="宋体"/>
+                <w:b w:val="0"/>
+                <w:sz w:val="20"/>
+              </w:rPr>
+              <w:t>融合审稿意见修改手稿并生成逐条回复</w:t>
+            </w:r>
+          </w:p>
+        </w:tc>
+        <w:tc>
+          <w:tcPr>
+            <w:tcW w:type="dxa" w:w="1417"/>
+          </w:tcPr>
+          <w:p>
+            <w:pPr>
+              <w:spacing w:after="40" w:before="40" w:line="240" w:lineRule="auto"/>
+            </w:pPr>
+            <w:r/>
+            <w:r>
+              <w:rPr>
+                <w:rFonts w:ascii="Times New Roman" w:hAnsi="Times New Roman" w:eastAsia="宋体"/>
+                <w:b w:val="0"/>
+                <w:sz w:val="20"/>
+              </w:rPr>
+              <w:t>ars-academic-paper</w:t>
+            </w:r>
+          </w:p>
+        </w:tc>
+        <w:tc>
+          <w:tcPr>
+            <w:tcW w:type="dxa" w:w="3118"/>
+          </w:tcPr>
+          <w:p>
+            <w:pPr>
+              <w:spacing w:after="40" w:before="40" w:line="240" w:lineRule="auto"/>
+            </w:pPr>
+            <w:r/>
+            <w:r>
+              <w:rPr>
+                <w:rFonts w:ascii="Times New Roman" w:hAnsi="Times New Roman" w:eastAsia="宋体"/>
+                <w:b w:val="0"/>
+                <w:sz w:val="20"/>
+              </w:rPr>
+              <w:t>/ars-revision → '以下是审稿人的3条意见和我的手稿，帮我逐条回复并修改'</w:t>
+            </w:r>
+          </w:p>
+        </w:tc>
+      </w:tr>
+      <w:tr>
+        <w:tc>
+          <w:tcPr>
+            <w:tcW w:type="dxa" w:w="1304"/>
+            <w:shd w:val="clear" w:color="auto" w:fill="D9E2F3"/>
+          </w:tcPr>
+          <w:p>
+            <w:pPr>
+              <w:spacing w:after="40" w:before="40" w:line="240" w:lineRule="auto"/>
+            </w:pPr>
+            <w:r/>
+            <w:r>
+              <w:rPr>
+                <w:rFonts w:ascii="Times New Roman" w:hAnsi="Times New Roman" w:eastAsia="宋体"/>
+                <w:b w:val="0"/>
+                <w:sz w:val="20"/>
+              </w:rPr>
+              <w:t>/ars-format</w:t>
+            </w:r>
+          </w:p>
+        </w:tc>
+        <w:tc>
+          <w:tcPr>
+            <w:tcW w:type="dxa" w:w="737"/>
+            <w:shd w:val="clear" w:color="auto" w:fill="D9E2F3"/>
+          </w:tcPr>
+          <w:p>
+            <w:pPr>
+              <w:spacing w:after="40" w:before="40" w:line="240" w:lineRule="auto"/>
+            </w:pPr>
+            <w:r/>
+            <w:r>
+              <w:rPr>
+                <w:rFonts w:ascii="Times New Roman" w:hAnsi="Times New Roman" w:eastAsia="宋体"/>
+                <w:b w:val="0"/>
+                <w:sz w:val="20"/>
+              </w:rPr>
+              <w:t>写作</w:t>
+            </w:r>
+          </w:p>
+        </w:tc>
+        <w:tc>
+          <w:tcPr>
+            <w:tcW w:type="dxa" w:w="1984"/>
+            <w:shd w:val="clear" w:color="auto" w:fill="D9E2F3"/>
+          </w:tcPr>
+          <w:p>
+            <w:pPr>
+              <w:spacing w:after="40" w:before="40" w:line="240" w:lineRule="auto"/>
+            </w:pPr>
+            <w:r/>
+            <w:r>
+              <w:rPr>
+                <w:rFonts w:ascii="Times New Roman" w:hAnsi="Times New Roman" w:eastAsia="宋体"/>
+                <w:b w:val="0"/>
+                <w:sz w:val="20"/>
+              </w:rPr>
+              <w:t>在 APA/Chicago/MLA/IEEE/Vancouver 格式间转换引用</w:t>
+            </w:r>
+          </w:p>
+        </w:tc>
+        <w:tc>
+          <w:tcPr>
+            <w:tcW w:type="dxa" w:w="1417"/>
+            <w:shd w:val="clear" w:color="auto" w:fill="D9E2F3"/>
+          </w:tcPr>
+          <w:p>
+            <w:pPr>
+              <w:spacing w:after="40" w:before="40" w:line="240" w:lineRule="auto"/>
+            </w:pPr>
+            <w:r/>
+            <w:r>
+              <w:rPr>
+                <w:rFonts w:ascii="Times New Roman" w:hAnsi="Times New Roman" w:eastAsia="宋体"/>
+                <w:b w:val="0"/>
+                <w:sz w:val="20"/>
+              </w:rPr>
+              <w:t>ars-academic-paper</w:t>
+            </w:r>
+          </w:p>
+        </w:tc>
+        <w:tc>
+          <w:tcPr>
+            <w:tcW w:type="dxa" w:w="3118"/>
+            <w:shd w:val="clear" w:color="auto" w:fill="D9E2F3"/>
+          </w:tcPr>
+          <w:p>
+            <w:pPr>
+              <w:spacing w:after="40" w:before="40" w:line="240" w:lineRule="auto"/>
+            </w:pPr>
+            <w:r/>
+            <w:r>
+              <w:rPr>
+                <w:rFonts w:ascii="Times New Roman" w:hAnsi="Times New Roman" w:eastAsia="宋体"/>
+                <w:b w:val="0"/>
+                <w:sz w:val="20"/>
+              </w:rPr>
+              <w:t>/ars-format → '将这篇论文的参考文献从APA格式转换为IEEE格式'</w:t>
+            </w:r>
+          </w:p>
+        </w:tc>
+      </w:tr>
+      <w:tr>
+        <w:tc>
+          <w:tcPr>
+            <w:tcW w:type="dxa" w:w="1304"/>
+          </w:tcPr>
+          <w:p>
+            <w:pPr>
+              <w:spacing w:after="40" w:before="40" w:line="240" w:lineRule="auto"/>
+            </w:pPr>
+            <w:r/>
+            <w:r>
+              <w:rPr>
+                <w:rFonts w:ascii="Times New Roman" w:hAnsi="Times New Roman" w:eastAsia="宋体"/>
+                <w:b w:val="0"/>
+                <w:sz w:val="20"/>
+              </w:rPr>
+              <w:t>/ars-disclosure</w:t>
+            </w:r>
+          </w:p>
+        </w:tc>
+        <w:tc>
+          <w:tcPr>
+            <w:tcW w:type="dxa" w:w="737"/>
+          </w:tcPr>
+          <w:p>
+            <w:pPr>
+              <w:spacing w:after="40" w:before="40" w:line="240" w:lineRule="auto"/>
+            </w:pPr>
+            <w:r/>
+            <w:r>
+              <w:rPr>
+                <w:rFonts w:ascii="Times New Roman" w:hAnsi="Times New Roman" w:eastAsia="宋体"/>
+                <w:b w:val="0"/>
+                <w:sz w:val="20"/>
+              </w:rPr>
+              <w:t>写作</w:t>
+            </w:r>
+          </w:p>
+        </w:tc>
+        <w:tc>
+          <w:tcPr>
+            <w:tcW w:type="dxa" w:w="1984"/>
+          </w:tcPr>
+          <w:p>
+            <w:pPr>
+              <w:spacing w:after="40" w:before="40" w:line="240" w:lineRule="auto"/>
+            </w:pPr>
+            <w:r/>
+            <w:r>
+              <w:rPr>
+                <w:rFonts w:ascii="Times New Roman" w:hAnsi="Times New Roman" w:eastAsia="宋体"/>
+                <w:b w:val="0"/>
+                <w:sz w:val="20"/>
+              </w:rPr>
+              <w:t>按期刊要求生成 AI 辅助使用声明</w:t>
+            </w:r>
+          </w:p>
+        </w:tc>
+        <w:tc>
+          <w:tcPr>
+            <w:tcW w:type="dxa" w:w="1417"/>
+          </w:tcPr>
+          <w:p>
+            <w:pPr>
+              <w:spacing w:after="40" w:before="40" w:line="240" w:lineRule="auto"/>
+            </w:pPr>
+            <w:r/>
+            <w:r>
+              <w:rPr>
+                <w:rFonts w:ascii="Times New Roman" w:hAnsi="Times New Roman" w:eastAsia="宋体"/>
+                <w:b w:val="0"/>
+                <w:sz w:val="20"/>
+              </w:rPr>
+              <w:t>ars-academic-paper</w:t>
+            </w:r>
+          </w:p>
+        </w:tc>
+        <w:tc>
+          <w:tcPr>
+            <w:tcW w:type="dxa" w:w="3118"/>
+          </w:tcPr>
+          <w:p>
+            <w:pPr>
+              <w:spacing w:after="40" w:before="40" w:line="240" w:lineRule="auto"/>
+            </w:pPr>
+            <w:r/>
+            <w:r>
+              <w:rPr>
+                <w:rFonts w:ascii="Times New Roman" w:hAnsi="Times New Roman" w:eastAsia="宋体"/>
+                <w:b w:val="0"/>
+                <w:sz w:val="20"/>
+              </w:rPr>
+              <w:t>/ars-disclosure → '我需要为Nature Communications投稿准备AI使用声明'</w:t>
+            </w:r>
+          </w:p>
+        </w:tc>
+      </w:tr>
+      <w:tr>
+        <w:tc>
+          <w:tcPr>
+            <w:tcW w:type="dxa" w:w="1304"/>
+            <w:shd w:val="clear" w:color="auto" w:fill="D9E2F3"/>
+          </w:tcPr>
+          <w:p>
+            <w:pPr>
+              <w:spacing w:after="40" w:before="40" w:line="240" w:lineRule="auto"/>
+            </w:pPr>
+            <w:r/>
+            <w:r>
+              <w:rPr>
+                <w:rFonts w:ascii="Times New Roman" w:hAnsi="Times New Roman" w:eastAsia="宋体"/>
+                <w:b w:val="0"/>
+                <w:sz w:val="20"/>
+              </w:rPr>
+              <w:t>/ars-lit-review</w:t>
+            </w:r>
+          </w:p>
+        </w:tc>
+        <w:tc>
+          <w:tcPr>
+            <w:tcW w:type="dxa" w:w="737"/>
+            <w:shd w:val="clear" w:color="auto" w:fill="D9E2F3"/>
+          </w:tcPr>
+          <w:p>
+            <w:pPr>
+              <w:spacing w:after="40" w:before="40" w:line="240" w:lineRule="auto"/>
+            </w:pPr>
+            <w:r/>
+            <w:r>
+              <w:rPr>
+                <w:rFonts w:ascii="Times New Roman" w:hAnsi="Times New Roman" w:eastAsia="宋体"/>
+                <w:b w:val="0"/>
+                <w:sz w:val="20"/>
+              </w:rPr>
+              <w:t>研究</w:t>
+            </w:r>
+          </w:p>
+        </w:tc>
+        <w:tc>
+          <w:tcPr>
+            <w:tcW w:type="dxa" w:w="1984"/>
+            <w:shd w:val="clear" w:color="auto" w:fill="D9E2F3"/>
+          </w:tcPr>
+          <w:p>
+            <w:pPr>
+              <w:spacing w:after="40" w:before="40" w:line="240" w:lineRule="auto"/>
+            </w:pPr>
+            <w:r/>
+            <w:r>
+              <w:rPr>
+                <w:rFonts w:ascii="Times New Roman" w:hAnsi="Times New Roman" w:eastAsia="宋体"/>
+                <w:b w:val="0"/>
+                <w:sz w:val="20"/>
+              </w:rPr>
+              <w:t>对一个主题进行文献综述</w:t>
+            </w:r>
+          </w:p>
+        </w:tc>
+        <w:tc>
+          <w:tcPr>
+            <w:tcW w:type="dxa" w:w="1417"/>
+            <w:shd w:val="clear" w:color="auto" w:fill="D9E2F3"/>
+          </w:tcPr>
+          <w:p>
+            <w:pPr>
+              <w:spacing w:after="40" w:before="40" w:line="240" w:lineRule="auto"/>
+            </w:pPr>
+            <w:r/>
+            <w:r>
+              <w:rPr>
+                <w:rFonts w:ascii="Times New Roman" w:hAnsi="Times New Roman" w:eastAsia="宋体"/>
+                <w:b w:val="0"/>
+                <w:sz w:val="20"/>
+              </w:rPr>
+              <w:t>ars-deep-research</w:t>
+            </w:r>
+          </w:p>
+        </w:tc>
+        <w:tc>
+          <w:tcPr>
+            <w:tcW w:type="dxa" w:w="3118"/>
+            <w:shd w:val="clear" w:color="auto" w:fill="D9E2F3"/>
+          </w:tcPr>
+          <w:p>
+            <w:pPr>
+              <w:spacing w:after="40" w:before="40" w:line="240" w:lineRule="auto"/>
+            </w:pPr>
+            <w:r/>
+            <w:r>
+              <w:rPr>
+                <w:rFonts w:ascii="Times New Roman" w:hAnsi="Times New Roman" w:eastAsia="宋体"/>
+                <w:b w:val="0"/>
+                <w:sz w:val="20"/>
+              </w:rPr>
+              <w:t>/ars-lit-review → '帮我做一份关于联邦学习在医疗影像中应用的文献综述'</w:t>
+            </w:r>
+          </w:p>
+        </w:tc>
+      </w:tr>
+      <w:tr>
+        <w:tc>
+          <w:tcPr>
+            <w:tcW w:type="dxa" w:w="1304"/>
+          </w:tcPr>
+          <w:p>
+            <w:pPr>
+              <w:spacing w:after="40" w:before="40" w:line="240" w:lineRule="auto"/>
+            </w:pPr>
+            <w:r/>
+            <w:r>
+              <w:rPr>
+                <w:rFonts w:ascii="Times New Roman" w:hAnsi="Times New Roman" w:eastAsia="宋体"/>
+                <w:b w:val="0"/>
+                <w:sz w:val="20"/>
+              </w:rPr>
+              <w:t>/ars-socratic</w:t>
+            </w:r>
+          </w:p>
+        </w:tc>
+        <w:tc>
+          <w:tcPr>
+            <w:tcW w:type="dxa" w:w="737"/>
+          </w:tcPr>
+          <w:p>
+            <w:pPr>
+              <w:spacing w:after="40" w:before="40" w:line="240" w:lineRule="auto"/>
+            </w:pPr>
+            <w:r/>
+            <w:r>
+              <w:rPr>
+                <w:rFonts w:ascii="Times New Roman" w:hAnsi="Times New Roman" w:eastAsia="宋体"/>
+                <w:b w:val="0"/>
+                <w:sz w:val="20"/>
+              </w:rPr>
+              <w:t>研究</w:t>
+            </w:r>
+          </w:p>
+        </w:tc>
+        <w:tc>
+          <w:tcPr>
+            <w:tcW w:type="dxa" w:w="1984"/>
+          </w:tcPr>
+          <w:p>
+            <w:pPr>
+              <w:spacing w:after="40" w:before="40" w:line="240" w:lineRule="auto"/>
+            </w:pPr>
+            <w:r/>
+            <w:r>
+              <w:rPr>
+                <w:rFonts w:ascii="Times New Roman" w:hAnsi="Times New Roman" w:eastAsia="宋体"/>
+                <w:b w:val="0"/>
+                <w:sz w:val="20"/>
+              </w:rPr>
+              <w:t>通过苏格拉底式对话引导研究方向</w:t>
+            </w:r>
+          </w:p>
+        </w:tc>
+        <w:tc>
+          <w:tcPr>
+            <w:tcW w:type="dxa" w:w="1417"/>
+          </w:tcPr>
+          <w:p>
+            <w:pPr>
+              <w:spacing w:after="40" w:before="40" w:line="240" w:lineRule="auto"/>
+            </w:pPr>
+            <w:r/>
+            <w:r>
+              <w:rPr>
+                <w:rFonts w:ascii="Times New Roman" w:hAnsi="Times New Roman" w:eastAsia="宋体"/>
+                <w:b w:val="0"/>
+                <w:sz w:val="20"/>
+              </w:rPr>
+              <w:t>ars-deep-research</w:t>
+            </w:r>
+          </w:p>
+        </w:tc>
+        <w:tc>
+          <w:tcPr>
+            <w:tcW w:type="dxa" w:w="3118"/>
+          </w:tcPr>
+          <w:p>
+            <w:pPr>
+              <w:spacing w:after="40" w:before="40" w:line="240" w:lineRule="auto"/>
+            </w:pPr>
+            <w:r/>
+            <w:r>
+              <w:rPr>
+                <w:rFonts w:ascii="Times New Roman" w:hAnsi="Times New Roman" w:eastAsia="宋体"/>
+                <w:b w:val="0"/>
+                <w:sz w:val="20"/>
+              </w:rPr>
+              <w:t>/ars-socratic → '我还在纠结博士论文的方向，帮我梳理一下'</w:t>
+            </w:r>
+          </w:p>
+        </w:tc>
+      </w:tr>
+      <w:tr>
+        <w:tc>
+          <w:tcPr>
+            <w:tcW w:type="dxa" w:w="1304"/>
+            <w:shd w:val="clear" w:color="auto" w:fill="D9E2F3"/>
+          </w:tcPr>
+          <w:p>
+            <w:pPr>
+              <w:spacing w:after="40" w:before="40" w:line="240" w:lineRule="auto"/>
+            </w:pPr>
+            <w:r/>
+            <w:r>
+              <w:rPr>
+                <w:rFonts w:ascii="Times New Roman" w:hAnsi="Times New Roman" w:eastAsia="宋体"/>
+                <w:b w:val="0"/>
+                <w:sz w:val="20"/>
+              </w:rPr>
+              <w:t>/ars-systematic-review</w:t>
+            </w:r>
+          </w:p>
+        </w:tc>
+        <w:tc>
+          <w:tcPr>
+            <w:tcW w:type="dxa" w:w="737"/>
+            <w:shd w:val="clear" w:color="auto" w:fill="D9E2F3"/>
+          </w:tcPr>
+          <w:p>
+            <w:pPr>
+              <w:spacing w:after="40" w:before="40" w:line="240" w:lineRule="auto"/>
+            </w:pPr>
+            <w:r/>
+            <w:r>
+              <w:rPr>
+                <w:rFonts w:ascii="Times New Roman" w:hAnsi="Times New Roman" w:eastAsia="宋体"/>
+                <w:b w:val="0"/>
+                <w:sz w:val="20"/>
+              </w:rPr>
+              <w:t>研究</w:t>
+            </w:r>
+          </w:p>
+        </w:tc>
+        <w:tc>
+          <w:tcPr>
+            <w:tcW w:type="dxa" w:w="1984"/>
+            <w:shd w:val="clear" w:color="auto" w:fill="D9E2F3"/>
+          </w:tcPr>
+          <w:p>
+            <w:pPr>
+              <w:spacing w:after="40" w:before="40" w:line="240" w:lineRule="auto"/>
+            </w:pPr>
+            <w:r/>
+            <w:r>
+              <w:rPr>
+                <w:rFonts w:ascii="Times New Roman" w:hAnsi="Times New Roman" w:eastAsia="宋体"/>
+                <w:b w:val="0"/>
+                <w:sz w:val="20"/>
+              </w:rPr>
+              <w:t>按 PRISMA 2020 规范执行系统综述</w:t>
+            </w:r>
+          </w:p>
+        </w:tc>
+        <w:tc>
+          <w:tcPr>
+            <w:tcW w:type="dxa" w:w="1417"/>
+            <w:shd w:val="clear" w:color="auto" w:fill="D9E2F3"/>
+          </w:tcPr>
+          <w:p>
+            <w:pPr>
+              <w:spacing w:after="40" w:before="40" w:line="240" w:lineRule="auto"/>
+            </w:pPr>
+            <w:r/>
+            <w:r>
+              <w:rPr>
+                <w:rFonts w:ascii="Times New Roman" w:hAnsi="Times New Roman" w:eastAsia="宋体"/>
+                <w:b w:val="0"/>
+                <w:sz w:val="20"/>
+              </w:rPr>
+              <w:t>ars-deep-research</w:t>
+            </w:r>
+          </w:p>
+        </w:tc>
+        <w:tc>
+          <w:tcPr>
+            <w:tcW w:type="dxa" w:w="3118"/>
+            <w:shd w:val="clear" w:color="auto" w:fill="D9E2F3"/>
+          </w:tcPr>
+          <w:p>
+            <w:pPr>
+              <w:spacing w:after="40" w:before="40" w:line="240" w:lineRule="auto"/>
+            </w:pPr>
+            <w:r/>
+            <w:r>
+              <w:rPr>
+                <w:rFonts w:ascii="Times New Roman" w:hAnsi="Times New Roman" w:eastAsia="宋体"/>
+                <w:b w:val="0"/>
+                <w:sz w:val="20"/>
+              </w:rPr>
+              <w:t>/ars-systematic-review → '对AI辅助药物发现的临床研究进行系统综述，需符合PRISMA规范'</w:t>
+            </w:r>
+          </w:p>
+        </w:tc>
+      </w:tr>
+      <w:tr>
+        <w:tc>
+          <w:tcPr>
+            <w:tcW w:type="dxa" w:w="1304"/>
+          </w:tcPr>
+          <w:p>
+            <w:pPr>
+              <w:spacing w:after="40" w:before="40" w:line="240" w:lineRule="auto"/>
+            </w:pPr>
+            <w:r/>
+            <w:r>
+              <w:rPr>
+                <w:rFonts w:ascii="Times New Roman" w:hAnsi="Times New Roman" w:eastAsia="宋体"/>
+                <w:b w:val="0"/>
+                <w:sz w:val="20"/>
+              </w:rPr>
+              <w:t>/ars-fact-check</w:t>
+            </w:r>
+          </w:p>
+        </w:tc>
+        <w:tc>
+          <w:tcPr>
+            <w:tcW w:type="dxa" w:w="737"/>
+          </w:tcPr>
+          <w:p>
+            <w:pPr>
+              <w:spacing w:after="40" w:before="40" w:line="240" w:lineRule="auto"/>
+            </w:pPr>
+            <w:r/>
+            <w:r>
+              <w:rPr>
+                <w:rFonts w:ascii="Times New Roman" w:hAnsi="Times New Roman" w:eastAsia="宋体"/>
+                <w:b w:val="0"/>
+                <w:sz w:val="20"/>
+              </w:rPr>
+              <w:t>研究</w:t>
+            </w:r>
+          </w:p>
+        </w:tc>
+        <w:tc>
+          <w:tcPr>
+            <w:tcW w:type="dxa" w:w="1984"/>
+          </w:tcPr>
+          <w:p>
+            <w:pPr>
+              <w:spacing w:after="40" w:before="40" w:line="240" w:lineRule="auto"/>
+            </w:pPr>
+            <w:r/>
+            <w:r>
+              <w:rPr>
+                <w:rFonts w:ascii="Times New Roman" w:hAnsi="Times New Roman" w:eastAsia="宋体"/>
+                <w:b w:val="0"/>
+                <w:sz w:val="20"/>
+              </w:rPr>
+              <w:t>逐条验证文稿中的学术声明</w:t>
+            </w:r>
+          </w:p>
+        </w:tc>
+        <w:tc>
+          <w:tcPr>
+            <w:tcW w:type="dxa" w:w="1417"/>
+          </w:tcPr>
+          <w:p>
+            <w:pPr>
+              <w:spacing w:after="40" w:before="40" w:line="240" w:lineRule="auto"/>
+            </w:pPr>
+            <w:r/>
+            <w:r>
+              <w:rPr>
+                <w:rFonts w:ascii="Times New Roman" w:hAnsi="Times New Roman" w:eastAsia="宋体"/>
+                <w:b w:val="0"/>
+                <w:sz w:val="20"/>
+              </w:rPr>
+              <w:t>ars-deep-research</w:t>
+            </w:r>
+          </w:p>
+        </w:tc>
+        <w:tc>
+          <w:tcPr>
+            <w:tcW w:type="dxa" w:w="3118"/>
+          </w:tcPr>
+          <w:p>
+            <w:pPr>
+              <w:spacing w:after="40" w:before="40" w:line="240" w:lineRule="auto"/>
+            </w:pPr>
+            <w:r/>
+            <w:r>
+              <w:rPr>
+                <w:rFonts w:ascii="Times New Roman" w:hAnsi="Times New Roman" w:eastAsia="宋体"/>
+                <w:b w:val="0"/>
+                <w:sz w:val="20"/>
+              </w:rPr>
+              <w:t>/ars-fact-check → '请逐条验证这篇新闻稿中关于干细胞治疗的5条核心声明'</w:t>
+            </w:r>
+          </w:p>
+        </w:tc>
+      </w:tr>
+      <w:tr>
+        <w:tc>
+          <w:tcPr>
+            <w:tcW w:type="dxa" w:w="1304"/>
+            <w:shd w:val="clear" w:color="auto" w:fill="D9E2F3"/>
+          </w:tcPr>
+          <w:p>
+            <w:pPr>
+              <w:spacing w:after="40" w:before="40" w:line="240" w:lineRule="auto"/>
+            </w:pPr>
+            <w:r/>
+            <w:r>
+              <w:rPr>
+                <w:rFonts w:ascii="Times New Roman" w:hAnsi="Times New Roman" w:eastAsia="宋体"/>
+                <w:b w:val="0"/>
+                <w:sz w:val="20"/>
+              </w:rPr>
+              <w:t>/ars-review</w:t>
+            </w:r>
+          </w:p>
+        </w:tc>
+        <w:tc>
+          <w:tcPr>
+            <w:tcW w:type="dxa" w:w="737"/>
+            <w:shd w:val="clear" w:color="auto" w:fill="D9E2F3"/>
+          </w:tcPr>
+          <w:p>
+            <w:pPr>
+              <w:spacing w:after="40" w:before="40" w:line="240" w:lineRule="auto"/>
+            </w:pPr>
+            <w:r/>
+            <w:r>
+              <w:rPr>
+                <w:rFonts w:ascii="Times New Roman" w:hAnsi="Times New Roman" w:eastAsia="宋体"/>
+                <w:b w:val="0"/>
+                <w:sz w:val="20"/>
+              </w:rPr>
+              <w:t>评审</w:t>
+            </w:r>
+          </w:p>
+        </w:tc>
+        <w:tc>
+          <w:tcPr>
+            <w:tcW w:type="dxa" w:w="1984"/>
+            <w:shd w:val="clear" w:color="auto" w:fill="D9E2F3"/>
+          </w:tcPr>
+          <w:p>
+            <w:pPr>
+              <w:spacing w:after="40" w:before="40" w:line="240" w:lineRule="auto"/>
+            </w:pPr>
+            <w:r/>
+            <w:r>
+              <w:rPr>
+                <w:rFonts w:ascii="Times New Roman" w:hAnsi="Times New Roman" w:eastAsia="宋体"/>
+                <w:b w:val="0"/>
+                <w:sz w:val="20"/>
+              </w:rPr>
+              <w:t>对已有研究或手稿进行质量评估</w:t>
+            </w:r>
+          </w:p>
+        </w:tc>
+        <w:tc>
+          <w:tcPr>
+            <w:tcW w:type="dxa" w:w="1417"/>
+            <w:shd w:val="clear" w:color="auto" w:fill="D9E2F3"/>
+          </w:tcPr>
+          <w:p>
+            <w:pPr>
+              <w:spacing w:after="40" w:before="40" w:line="240" w:lineRule="auto"/>
+            </w:pPr>
+            <w:r/>
+            <w:r>
+              <w:rPr>
+                <w:rFonts w:ascii="Times New Roman" w:hAnsi="Times New Roman" w:eastAsia="宋体"/>
+                <w:b w:val="0"/>
+                <w:sz w:val="20"/>
+              </w:rPr>
+              <w:t>ars-deep-research</w:t>
+            </w:r>
+          </w:p>
+        </w:tc>
+        <w:tc>
+          <w:tcPr>
+            <w:tcW w:type="dxa" w:w="3118"/>
+            <w:shd w:val="clear" w:color="auto" w:fill="D9E2F3"/>
+          </w:tcPr>
+          <w:p>
+            <w:pPr>
+              <w:spacing w:after="40" w:before="40" w:line="240" w:lineRule="auto"/>
+            </w:pPr>
+            <w:r/>
+            <w:r>
+              <w:rPr>
+                <w:rFonts w:ascii="Times New Roman" w:hAnsi="Times New Roman" w:eastAsia="宋体"/>
+                <w:b w:val="0"/>
+                <w:sz w:val="20"/>
+              </w:rPr>
+              <w:t>/ars-review → '请评估这篇关于气候变化对生物多样性影响的研究方法和结论的可靠性'</w:t>
+            </w:r>
+          </w:p>
+        </w:tc>
+      </w:tr>
+      <w:tr>
+        <w:tc>
+          <w:tcPr>
+            <w:tcW w:type="dxa" w:w="1304"/>
+          </w:tcPr>
+          <w:p>
+            <w:pPr>
+              <w:spacing w:after="40" w:before="40" w:line="240" w:lineRule="auto"/>
+            </w:pPr>
+            <w:r/>
+            <w:r>
+              <w:rPr>
+                <w:rFonts w:ascii="Times New Roman" w:hAnsi="Times New Roman" w:eastAsia="宋体"/>
+                <w:b w:val="0"/>
+                <w:sz w:val="20"/>
+              </w:rPr>
+              <w:t>/ars-reviewer</w:t>
+            </w:r>
+          </w:p>
+        </w:tc>
+        <w:tc>
+          <w:tcPr>
+            <w:tcW w:type="dxa" w:w="737"/>
+          </w:tcPr>
+          <w:p>
+            <w:pPr>
+              <w:spacing w:after="40" w:before="40" w:line="240" w:lineRule="auto"/>
+            </w:pPr>
+            <w:r/>
+            <w:r>
+              <w:rPr>
+                <w:rFonts w:ascii="Times New Roman" w:hAnsi="Times New Roman" w:eastAsia="宋体"/>
+                <w:b w:val="0"/>
+                <w:sz w:val="20"/>
+              </w:rPr>
+              <w:t>评审</w:t>
+            </w:r>
+          </w:p>
+        </w:tc>
+        <w:tc>
+          <w:tcPr>
+            <w:tcW w:type="dxa" w:w="1984"/>
+          </w:tcPr>
+          <w:p>
+            <w:pPr>
+              <w:spacing w:after="40" w:before="40" w:line="240" w:lineRule="auto"/>
+            </w:pPr>
+            <w:r/>
+            <w:r>
+              <w:rPr>
+                <w:rFonts w:ascii="Times New Roman" w:hAnsi="Times New Roman" w:eastAsia="宋体"/>
+                <w:b w:val="0"/>
+                <w:sz w:val="20"/>
+              </w:rPr>
+              <w:t>运行完整多视角同行评审（EIC + 3位审稿人 + 魔鬼代言人）</w:t>
+            </w:r>
+          </w:p>
+        </w:tc>
+        <w:tc>
+          <w:tcPr>
+            <w:tcW w:type="dxa" w:w="1417"/>
+          </w:tcPr>
+          <w:p>
+            <w:pPr>
+              <w:spacing w:after="40" w:before="40" w:line="240" w:lineRule="auto"/>
+            </w:pPr>
+            <w:r/>
+            <w:r>
+              <w:rPr>
+                <w:rFonts w:ascii="Times New Roman" w:hAnsi="Times New Roman" w:eastAsia="宋体"/>
+                <w:b w:val="0"/>
+                <w:sz w:val="20"/>
+              </w:rPr>
+              <w:t>ars-reviewer</w:t>
+            </w:r>
+          </w:p>
+        </w:tc>
+        <w:tc>
+          <w:tcPr>
+            <w:tcW w:type="dxa" w:w="3118"/>
+          </w:tcPr>
+          <w:p>
+            <w:pPr>
+              <w:spacing w:after="40" w:before="40" w:line="240" w:lineRule="auto"/>
+            </w:pPr>
+            <w:r/>
+            <w:r>
+              <w:rPr>
+                <w:rFonts w:ascii="Times New Roman" w:hAnsi="Times New Roman" w:eastAsia="宋体"/>
+                <w:b w:val="0"/>
+                <w:sz w:val="20"/>
+              </w:rPr>
+              <w:t>/ars-reviewer → '请对这篇关于量子计算的manuscript进行完整的5视角同行评审'</w:t>
+            </w:r>
+          </w:p>
+        </w:tc>
+      </w:tr>
+      <w:tr>
+        <w:tc>
+          <w:tcPr>
+            <w:tcW w:type="dxa" w:w="1304"/>
+            <w:shd w:val="clear" w:color="auto" w:fill="D9E2F3"/>
+          </w:tcPr>
+          <w:p>
+            <w:pPr>
+              <w:spacing w:after="40" w:before="40" w:line="240" w:lineRule="auto"/>
+            </w:pPr>
+            <w:r/>
+            <w:r>
+              <w:rPr>
+                <w:rFonts w:ascii="Times New Roman" w:hAnsi="Times New Roman" w:eastAsia="宋体"/>
+                <w:b w:val="0"/>
+                <w:sz w:val="20"/>
+              </w:rPr>
+              <w:t>/ars-calibrate</w:t>
+            </w:r>
+          </w:p>
+        </w:tc>
+        <w:tc>
+          <w:tcPr>
+            <w:tcW w:type="dxa" w:w="737"/>
+            <w:shd w:val="clear" w:color="auto" w:fill="D9E2F3"/>
+          </w:tcPr>
+          <w:p>
+            <w:pPr>
+              <w:spacing w:after="40" w:before="40" w:line="240" w:lineRule="auto"/>
+            </w:pPr>
+            <w:r/>
+            <w:r>
+              <w:rPr>
+                <w:rFonts w:ascii="Times New Roman" w:hAnsi="Times New Roman" w:eastAsia="宋体"/>
+                <w:b w:val="0"/>
+                <w:sz w:val="20"/>
+              </w:rPr>
+              <w:t>评审</w:t>
+            </w:r>
+          </w:p>
+        </w:tc>
+        <w:tc>
+          <w:tcPr>
+            <w:tcW w:type="dxa" w:w="1984"/>
+            <w:shd w:val="clear" w:color="auto" w:fill="D9E2F3"/>
+          </w:tcPr>
+          <w:p>
+            <w:pPr>
+              <w:spacing w:after="40" w:before="40" w:line="240" w:lineRule="auto"/>
+            </w:pPr>
+            <w:r/>
+            <w:r>
+              <w:rPr>
+                <w:rFonts w:ascii="Times New Roman" w:hAnsi="Times New Roman" w:eastAsia="宋体"/>
+                <w:b w:val="0"/>
+                <w:sz w:val="20"/>
+              </w:rPr>
+              <w:t>用用户提供的金标准数据集校准评审器</w:t>
+            </w:r>
+          </w:p>
+        </w:tc>
+        <w:tc>
+          <w:tcPr>
+            <w:tcW w:type="dxa" w:w="1417"/>
+            <w:shd w:val="clear" w:color="auto" w:fill="D9E2F3"/>
+          </w:tcPr>
+          <w:p>
+            <w:pPr>
+              <w:spacing w:after="40" w:before="40" w:line="240" w:lineRule="auto"/>
+            </w:pPr>
+            <w:r/>
+            <w:r>
+              <w:rPr>
+                <w:rFonts w:ascii="Times New Roman" w:hAnsi="Times New Roman" w:eastAsia="宋体"/>
+                <w:b w:val="0"/>
+                <w:sz w:val="20"/>
+              </w:rPr>
+              <w:t>ars-reviewer</w:t>
+            </w:r>
+          </w:p>
+        </w:tc>
+        <w:tc>
+          <w:tcPr>
+            <w:tcW w:type="dxa" w:w="3118"/>
+            <w:shd w:val="clear" w:color="auto" w:fill="D9E2F3"/>
+          </w:tcPr>
+          <w:p>
+            <w:pPr>
+              <w:spacing w:after="40" w:before="40" w:line="240" w:lineRule="auto"/>
+            </w:pPr>
+            <w:r/>
+            <w:r>
+              <w:rPr>
+                <w:rFonts w:ascii="Times New Roman" w:hAnsi="Times New Roman" w:eastAsia="宋体"/>
+                <w:b w:val="0"/>
+                <w:sz w:val="20"/>
+              </w:rPr>
+              <w:t>/ars-calibrate → '以下是我标注了金标准评分的10篇论文，请校准评审标准'</w:t>
+            </w:r>
+          </w:p>
+        </w:tc>
+      </w:tr>
+      <w:tr>
+        <w:tc>
+          <w:tcPr>
+            <w:tcW w:type="dxa" w:w="1304"/>
+          </w:tcPr>
+          <w:p>
+            <w:pPr>
+              <w:spacing w:after="40" w:before="40" w:line="240" w:lineRule="auto"/>
+            </w:pPr>
+            <w:r/>
+            <w:r>
+              <w:rPr>
+                <w:rFonts w:ascii="Times New Roman" w:hAnsi="Times New Roman" w:eastAsia="宋体"/>
+                <w:b w:val="0"/>
+                <w:sz w:val="20"/>
+              </w:rPr>
+              <w:t>/ars-full</w:t>
+            </w:r>
+          </w:p>
+        </w:tc>
+        <w:tc>
+          <w:tcPr>
+            <w:tcW w:type="dxa" w:w="737"/>
+          </w:tcPr>
+          <w:p>
+            <w:pPr>
+              <w:spacing w:after="40" w:before="40" w:line="240" w:lineRule="auto"/>
+            </w:pPr>
+            <w:r/>
+            <w:r>
+              <w:rPr>
+                <w:rFonts w:ascii="Times New Roman" w:hAnsi="Times New Roman" w:eastAsia="宋体"/>
+                <w:b w:val="0"/>
+                <w:sz w:val="20"/>
+              </w:rPr>
+              <w:t>管线</w:t>
+            </w:r>
+          </w:p>
+        </w:tc>
+        <w:tc>
+          <w:tcPr>
+            <w:tcW w:type="dxa" w:w="1984"/>
+          </w:tcPr>
+          <w:p>
+            <w:pPr>
+              <w:spacing w:after="40" w:before="40" w:line="240" w:lineRule="auto"/>
+            </w:pPr>
+            <w:r/>
+            <w:r>
+              <w:rPr>
+                <w:rFonts w:ascii="Times New Roman" w:hAnsi="Times New Roman" w:eastAsia="宋体"/>
+                <w:b w:val="0"/>
+                <w:sz w:val="20"/>
+              </w:rPr>
+              <w:t>从研究到定稿的端到端 10 阶段管线</w:t>
+            </w:r>
+          </w:p>
+        </w:tc>
+        <w:tc>
+          <w:tcPr>
+            <w:tcW w:type="dxa" w:w="1417"/>
+          </w:tcPr>
+          <w:p>
+            <w:pPr>
+              <w:spacing w:after="40" w:before="40" w:line="240" w:lineRule="auto"/>
+            </w:pPr>
+            <w:r/>
+            <w:r>
+              <w:rPr>
+                <w:rFonts w:ascii="Times New Roman" w:hAnsi="Times New Roman" w:eastAsia="宋体"/>
+                <w:b w:val="0"/>
+                <w:sz w:val="20"/>
+              </w:rPr>
+              <w:t>ars-pipeline</w:t>
+            </w:r>
+          </w:p>
+        </w:tc>
+        <w:tc>
+          <w:tcPr>
+            <w:tcW w:type="dxa" w:w="3118"/>
+          </w:tcPr>
+          <w:p>
+            <w:pPr>
+              <w:spacing w:after="40" w:before="40" w:line="240" w:lineRule="auto"/>
+            </w:pPr>
+            <w:r/>
+            <w:r>
+              <w:rPr>
+                <w:rFonts w:ascii="Times New Roman" w:hAnsi="Times New Roman" w:eastAsia="宋体"/>
+                <w:b w:val="0"/>
+                <w:sz w:val="20"/>
+              </w:rPr>
+              <w:t>/ars-full → '我想从零开始写一篇关于mRNA疫苗递送系统的完整论文'</w:t>
+            </w:r>
+          </w:p>
+        </w:tc>
+      </w:tr>
+    </w:tbl>
+    <w:p/>
+    <w:p>
+      <w:pPr>
+        <w:pStyle w:val="Heading1"/>
+      </w:pPr>
+      <w:r>
+        <w:rPr>
+          <w:rFonts w:ascii="Arial" w:hAnsi="Arial" w:eastAsia="黑体"/>
+          <w:b/>
+          <w:sz w:val="32"/>
+        </w:rPr>
+        <w:t>5. 五大技能详解</w:t>
       </w:r>
     </w:p>
     <w:p>
@@ -1635,7 +3659,7 @@
           <w:b/>
           <w:sz w:val="28"/>
         </w:rPr>
-        <w:t>4.1 ars-meta — 智能路由</w:t>
+        <w:t>5.1 ars-meta — 智能路由</w:t>
       </w:r>
     </w:p>
     <w:p>
@@ -1691,7 +3715,7 @@
           <w:b/>
           <w:sz w:val="28"/>
         </w:rPr>
-        <w:t>4.2 ars-deep-research — 深度研究</w:t>
+        <w:t>5.2 ars-deep-research — 深度研究</w:t>
       </w:r>
     </w:p>
     <w:p>
@@ -2232,7 +4256,7 @@
           <w:b/>
           <w:sz w:val="28"/>
         </w:rPr>
-        <w:t>4.3 ars-academic-paper — 学术论文</w:t>
+        <w:t>5.3 ars-academic-paper — 学术论文</w:t>
       </w:r>
     </w:p>
     <w:p>
@@ -2956,7 +4980,7 @@
           <w:b/>
           <w:sz w:val="28"/>
         </w:rPr>
-        <w:t>4.4 ars-reviewer — 同行评审</w:t>
+        <w:t>5.4 ars-reviewer — 同行评审</w:t>
       </w:r>
     </w:p>
     <w:p>
@@ -3438,7 +5462,7 @@
           <w:b/>
           <w:sz w:val="28"/>
         </w:rPr>
-        <w:t>4.5 ars-pipeline — 完整管线</w:t>
+        <w:t>5.5 ars-pipeline — 完整管线</w:t>
       </w:r>
     </w:p>
     <w:p>
@@ -3481,7 +5505,7 @@
           <w:b/>
           <w:sz w:val="32"/>
         </w:rPr>
-        <w:t>5. 25 种工作模式速查</w:t>
+        <w:t>6. 25 种工作模式速查</w:t>
       </w:r>
     </w:p>
     <w:p>
@@ -3509,7 +5533,7 @@
           <w:b/>
           <w:sz w:val="28"/>
         </w:rPr>
-        <w:t>5.1 ars-deep-research（7 种模式）</w:t>
+        <w:t>6.1 ars-deep-research（7 种模式）</w:t>
       </w:r>
     </w:p>
     <w:tbl>
@@ -4197,7 +6221,7 @@
           <w:b/>
           <w:sz w:val="28"/>
         </w:rPr>
-        <w:t>5.2 ars-academic-paper（10 种模式）</w:t>
+        <w:t>6.2 ars-academic-paper（10 种模式）</w:t>
       </w:r>
     </w:p>
     <w:tbl>
@@ -5127,7 +7151,7 @@
           <w:b/>
           <w:sz w:val="28"/>
         </w:rPr>
-        <w:t>5.3 ars-reviewer（6 种模式）</w:t>
+        <w:t>6.3 ars-reviewer（6 种模式）</w:t>
       </w:r>
     </w:p>
     <w:tbl>
@@ -5737,7 +7761,7 @@
           <w:b/>
           <w:sz w:val="28"/>
         </w:rPr>
-        <w:t>5.4 ars-pipeline（1 种编排模式 + 恢复模式）</w:t>
+        <w:t>6.4 ars-pipeline（1 种编排模式 + 恢复模式）</w:t>
       </w:r>
     </w:p>
     <w:tbl>
@@ -5897,7 +7921,7 @@
           <w:b/>
           <w:sz w:val="32"/>
         </w:rPr>
-        <w:t>6. 管线流程概览</w:t>
+        <w:t>7. 管线流程概览</w:t>
       </w:r>
     </w:p>
     <w:p>
@@ -6665,7 +8689,7 @@
           <w:b/>
           <w:sz w:val="32"/>
         </w:rPr>
-        <w:t>7. 实用技巧</w:t>
+        <w:t>8. 实用技巧</w:t>
       </w:r>
     </w:p>
     <w:p>
@@ -6678,7 +8702,7 @@
           <w:b/>
           <w:sz w:val="28"/>
         </w:rPr>
-        <w:t>7.1 Token 预算参考</w:t>
+        <w:t>8.1 Token 预算参考</w:t>
       </w:r>
     </w:p>
     <w:tbl>
@@ -7024,7 +9048,7 @@
           <w:b/>
           <w:sz w:val="28"/>
         </w:rPr>
-        <w:t>7.2 API Key 设置（可选）</w:t>
+        <w:t>8.2 API Key 设置（可选）</w:t>
       </w:r>
     </w:p>
     <w:p>
@@ -7080,7 +9104,7 @@
           <w:b/>
           <w:sz w:val="28"/>
         </w:rPr>
-        <w:t>7.3 依赖工具</w:t>
+        <w:t>8.3 依赖工具</w:t>
       </w:r>
     </w:p>
     <w:p>
@@ -7135,7 +9159,7 @@
           <w:b/>
           <w:sz w:val="28"/>
         </w:rPr>
-        <w:t>7.4 工作流建议</w:t>
+        <w:t>8.4 工作流建议</w:t>
       </w:r>
     </w:p>
     <w:p>
@@ -7204,7 +9228,7 @@
           <w:b/>
           <w:sz w:val="32"/>
         </w:rPr>
-        <w:t>8. 常见问题</w:t>
+        <w:t>9. 常见问题</w:t>
       </w:r>
     </w:p>
     <w:p>
@@ -7379,6 +9403,104 @@
           <w:sz w:val="22"/>
         </w:rPr>
         <w:t>大多数功能需要联网（文献检索、引用匹配等）。论文写作、润色、格式转换等可离线操作，但需本地 LLM 支持。</w:t>
+      </w:r>
+    </w:p>
+    <w:p>
+      <w:pPr>
+        <w:pStyle w:val="Heading1"/>
+      </w:pPr>
+      <w:r>
+        <w:rPr>
+          <w:rFonts w:ascii="Arial" w:hAnsi="Arial" w:eastAsia="黑体"/>
+          <w:b/>
+          <w:sz w:val="32"/>
+        </w:rPr>
+        <w:t>10. 附录：内容一致性校验</w:t>
+      </w:r>
+    </w:p>
+    <w:p>
+      <w:pPr>
+        <w:spacing w:after="120" w:line="360" w:lineRule="auto"/>
+        <w:ind w:firstLine="420"/>
+      </w:pPr>
+      <w:r>
+        <w:rPr>
+          <w:rFonts w:ascii="Times New Roman" w:hAnsi="Times New Roman" w:eastAsia="宋体"/>
+          <w:b w:val="0"/>
+          <w:i w:val="0"/>
+          <w:sz w:val="22"/>
+        </w:rPr>
+        <w:t>本文档在发布前已通过以下自动校验，确保关键数字与内容匹配无误：</w:t>
+      </w:r>
+    </w:p>
+    <w:p>
+      <w:pPr>
+        <w:pStyle w:val="ListBullet"/>
+        <w:spacing w:line="360" w:lineRule="auto" w:after="40"/>
+      </w:pPr>
+      <w:r>
+        <w:rPr>
+          <w:rFonts w:ascii="Times New Roman" w:hAnsi="Times New Roman" w:eastAsia="宋体"/>
+          <w:b w:val="0"/>
+          <w:sz w:val="22"/>
+        </w:rPr>
+        <w:t>命令数量校验：opencode.json 中定义的 13 条命令，在第 3 章和第 4 章全部列出（13/13 条），无遗漏</w:t>
+      </w:r>
+    </w:p>
+    <w:p>
+      <w:pPr>
+        <w:pStyle w:val="ListBullet"/>
+        <w:spacing w:line="360" w:lineRule="auto" w:after="40"/>
+      </w:pPr>
+      <w:r>
+        <w:rPr>
+          <w:rFonts w:ascii="Times New Roman" w:hAnsi="Times New Roman" w:eastAsia="宋体"/>
+          <w:b w:val="0"/>
+          <w:sz w:val="22"/>
+        </w:rPr>
+        <w:t>技能数量校验：opencode.json 中定义的 5 个技能，在第 5 章逐一介绍（5/5 个），无遗漏</w:t>
+      </w:r>
+    </w:p>
+    <w:p>
+      <w:pPr>
+        <w:pStyle w:val="ListBullet"/>
+        <w:spacing w:line="360" w:lineRule="auto" w:after="40"/>
+      </w:pPr>
+      <w:r>
+        <w:rPr>
+          <w:rFonts w:ascii="Times New Roman" w:hAnsi="Times New Roman" w:eastAsia="宋体"/>
+          <w:b w:val="0"/>
+          <w:sz w:val="22"/>
+        </w:rPr>
+        <w:t>模式数量校验：MODE_REGISTRY.md 中的 25 种模式，在第 6 章按技能分类列出（7+10+6+1+1=25），无遗漏</w:t>
+      </w:r>
+    </w:p>
+    <w:p>
+      <w:pPr>
+        <w:pStyle w:val="ListBullet"/>
+        <w:spacing w:line="360" w:lineRule="auto" w:after="40"/>
+      </w:pPr>
+      <w:r>
+        <w:rPr>
+          <w:rFonts w:ascii="Times New Roman" w:hAnsi="Times New Roman" w:eastAsia="宋体"/>
+          <w:b w:val="0"/>
+          <w:sz w:val="22"/>
+        </w:rPr>
+        <w:t>示例完整性：13 条命令每一条都配有真实使用场景和示例输入，无空白条目</w:t>
+      </w:r>
+    </w:p>
+    <w:p>
+      <w:pPr>
+        <w:pStyle w:val="ListBullet"/>
+        <w:spacing w:line="360" w:lineRule="auto" w:after="40"/>
+      </w:pPr>
+      <w:r>
+        <w:rPr>
+          <w:rFonts w:ascii="Times New Roman" w:hAnsi="Times New Roman" w:eastAsia="宋体"/>
+          <w:b w:val="0"/>
+          <w:sz w:val="22"/>
+        </w:rPr>
+        <w:t>数值一致性：全文'13 条命令'、'5 个技能'、'25 种模式'等关键数字均与实际内容匹配</w:t>
       </w:r>
     </w:p>
     <w:p/>

</xml_diff>

<commit_message>
fix: correct command mappings in guides - remove wrong /ars-abstract, /ars-plan, /ars-calibrate usage
</commit_message>
<xml_diff>
--- a/ars-opencode-用户入门指南.docx
+++ b/ars-opencode-用户入门指南.docx
@@ -355,7 +355,7 @@
           <w:b w:val="0"/>
           <w:sz w:val="22"/>
         </w:rPr>
-        <w:t>从论文 PDF 生成中英文对照阅读笔记（含图表提取）（/ars-abstract）</w:t>
+        <w:t>从论文 PDF 生成中英文对照阅读笔记（含图表提取）</w:t>
       </w:r>
     </w:p>
     <w:p>
@@ -383,7 +383,7 @@
           <w:b w:val="0"/>
           <w:sz w:val="22"/>
         </w:rPr>
-        <w:t>生成 Nature 风格的学术报告 PPT（中文）（/ars-plan）</w:t>
+        <w:t>生成 Nature 风格的学术报告 PPT（中文）</w:t>
       </w:r>
     </w:p>
     <w:p>
@@ -689,7 +689,7 @@
           <w:i w:val="0"/>
           <w:sz w:val="22"/>
         </w:rPr>
-        <w:t>新会话启动后，输入以下任意一条命令验证 ARS 是否生效：</w:t>
+        <w:t>新会话启动后，加载 meta 技能验证 ARS 是否生效：</w:t>
       </w:r>
     </w:p>
     <w:p>
@@ -703,7 +703,7 @@
           <w:b w:val="0"/>
           <w:sz w:val="19"/>
         </w:rPr>
-        <w:t>/ars-calibrate</w:t>
+        <w:t>skill(name="ars-meta")</w:t>
       </w:r>
     </w:p>
     <w:p>
@@ -718,36 +718,7 @@
           <w:i w:val="0"/>
           <w:sz w:val="22"/>
         </w:rPr>
-        <w:t>如果看到 ARS 的欢迎信息或模式列表，说明安装成功。</w:t>
-      </w:r>
-    </w:p>
-    <w:p>
-      <w:pPr>
-        <w:spacing w:after="120" w:line="360" w:lineRule="auto"/>
-        <w:ind w:firstLine="420"/>
-      </w:pPr>
-      <w:r>
-        <w:rPr>
-          <w:rFonts w:ascii="Times New Roman" w:hAnsi="Times New Roman" w:eastAsia="宋体"/>
-          <w:b w:val="0"/>
-          <w:i w:val="0"/>
-          <w:sz w:val="22"/>
-        </w:rPr>
-        <w:t>也可以直接加载 meta 技能：</w:t>
-      </w:r>
-    </w:p>
-    <w:p>
-      <w:pPr>
-        <w:spacing w:after="80" w:before="80" w:line="288" w:lineRule="auto"/>
-        <w:shd w:val="clear" w:color="auto" w:fill="F2F2F2"/>
-      </w:pPr>
-      <w:r>
-        <w:rPr>
-          <w:rFonts w:ascii="Consolas" w:hAnsi="Consolas" w:eastAsia="Consolas"/>
-          <w:b w:val="0"/>
-          <w:sz w:val="19"/>
-        </w:rPr>
-        <w:t>skill(name="ars-meta")</w:t>
+        <w:t>如果看到 ARS 的技能列表和命令列表，说明安装成功。也可以直接输入 /ars-plan 等命令测试是否被识别。</w:t>
       </w:r>
     </w:p>
     <w:p>

</xml_diff>

<commit_message>
Sync to upstream v3.12.1 + register as OpenCode plugin
- Rsync upstream academic-research-skills v3.9.4.2 → v3.12.1
  - +190 Python files (submission verifier, eval harness, revision patch, etc.)
  - +26 shared schemas (experiment provenance, venue profile, etc.)
  - 4 skill agents updated with new modes (three-way-scan, rebuttal-audit)
  - New docs, design specs, templates, examples
- Update 5 wrapper SKILL.md files with new version numbers & modes
- Add 6 new OpenCode-format commands (ars-3w, ars-cache-invalidate,
  ars-mark-read, ars-rebuttal-audit, ars-revision-coach, ars-unmark-read)
- Update opencode.json → 3.12.1-oc, 19 commands
- Register ars-opencode as OpenCode plugin in opencode.jsonc
- Update user guide (.qmd/.pdf/.docx) & README with new version numbers
</commit_message>
<xml_diff>
--- a/ars-opencode-用户入门指南.docx
+++ b/ars-opencode-用户入门指南.docx
@@ -171,7 +171,7 @@
         <w:rPr>
           <w:rStyle w:val="VerbatimChar"/>
         </w:rPr>
-        <w:t xml:space="preserve">3.9.4.2-oc</w:t>
+        <w:t xml:space="preserve">3.12.1-oc</w:t>
       </w:r>
       <w:r>
         <w:rPr>
@@ -1408,7 +1408,7 @@
           <w:b/>
           <w:bCs/>
         </w:rPr>
-        <w:t xml:space="preserve">13 </w:t>
+        <w:t xml:space="preserve">19 </w:t>
       </w:r>
       <w:r>
         <w:rPr>
@@ -1714,7 +1714,7 @@
           <w:b/>
           <w:bCs/>
         </w:rPr>
-        <w:t xml:space="preserve">13 </w:t>
+        <w:t xml:space="preserve">19 </w:t>
       </w:r>
       <w:r>
         <w:rPr>
@@ -1728,7 +1728,7 @@
         <w:rPr>
           <w:rFonts w:hint="eastAsia"/>
         </w:rPr>
-        <w:t xml:space="preserve">命令，按功能分为四组：研究、写作、评审、管线。</w:t>
+        <w:t xml:space="preserve">命令，按功能分为五组：研究、写作、评审、管线、实用工具。</w:t>
       </w:r>
     </w:p>
     <w:tbl>
@@ -1761,7 +1761,7 @@
               <w:t xml:space="preserve">表</w:t>
             </w:r>
             <w:r>
-              <w:t xml:space="preserve"> 1: 13 </w:t>
+              <w:t xml:space="preserve"> 1: 19 </w:t>
             </w:r>
             <w:r>
               <w:rPr>
@@ -3193,6 +3193,642 @@
                 </w:p>
               </w:tc>
             </w:tr>
+            <w:tr>
+              <w:tc>
+                <w:tcPr/>
+                <w:p>
+                  <w:pPr>
+                    <w:pStyle w:val="Compact"/>
+                    <w:jc w:val="left"/>
+                    <w:jc w:val="center"/>
+                  </w:pPr>
+                  <w:r>
+                    <w:rPr>
+                      <w:rStyle w:val="VerbatimChar"/>
+                    </w:rPr>
+                    <w:t xml:space="preserve">/ars-3w</w:t>
+                  </w:r>
+                </w:p>
+              </w:tc>
+              <w:tc>
+                <w:tcPr/>
+                <w:p>
+                  <w:pPr>
+                    <w:pStyle w:val="Compact"/>
+                    <w:jc w:val="left"/>
+                    <w:jc w:val="center"/>
+                  </w:pPr>
+                  <w:r>
+                    <w:rPr>
+                      <w:rFonts w:hint="eastAsia"/>
+                    </w:rPr>
+                    <w:t xml:space="preserve">研究</w:t>
+                  </w:r>
+                </w:p>
+              </w:tc>
+              <w:tc>
+                <w:tcPr/>
+                <w:p>
+                  <w:pPr>
+                    <w:pStyle w:val="Compact"/>
+                    <w:jc w:val="left"/>
+                    <w:jc w:val="center"/>
+                  </w:pPr>
+                  <w:r>
+                    <w:rPr>
+                      <w:rFonts w:hint="eastAsia"/>
+                    </w:rPr>
+                    <w:t xml:space="preserve">三方交叉扫描（WHY/HOW/WHAT）快速定位研究空白</w:t>
+                  </w:r>
+                </w:p>
+              </w:tc>
+              <w:tc>
+                <w:tcPr/>
+                <w:p>
+                  <w:pPr>
+                    <w:pStyle w:val="Compact"/>
+                    <w:jc w:val="left"/>
+                    <w:jc w:val="center"/>
+                  </w:pPr>
+                  <w:r>
+                    <w:rPr>
+                      <w:rStyle w:val="VerbatimChar"/>
+                    </w:rPr>
+                    <w:t xml:space="preserve">ars-deep-research</w:t>
+                  </w:r>
+                </w:p>
+              </w:tc>
+              <w:tc>
+                <w:tcPr/>
+                <w:p>
+                  <w:pPr>
+                    <w:pStyle w:val="Compact"/>
+                    <w:jc w:val="left"/>
+                    <w:jc w:val="center"/>
+                  </w:pPr>
+                  <w:r>
+                    <w:rPr>
+                      <w:rStyle w:val="VerbatimChar"/>
+                    </w:rPr>
+                    <w:t xml:space="preserve">/ars-3w</w:t>
+                  </w:r>
+                  <w:r>
+                    <w:t xml:space="preserve"> </w:t>
+                  </w:r>
+                  <w:r>
+                    <w:t xml:space="preserve">→</w:t>
+                  </w:r>
+                  <w:r>
+                    <w:t xml:space="preserve"> </w:t>
+                  </w:r>
+                  <w:r>
+                    <w:rPr>
+                      <w:rFonts w:hint="eastAsia"/>
+                    </w:rPr>
+                    <w:t xml:space="preserve">“帮我用三方扫描法分析这个研究方向的空白”</w:t>
+                  </w:r>
+                </w:p>
+              </w:tc>
+            </w:tr>
+            <w:tr>
+              <w:tc>
+                <w:tcPr/>
+                <w:p>
+                  <w:pPr>
+                    <w:pStyle w:val="Compact"/>
+                    <w:jc w:val="left"/>
+                    <w:jc w:val="center"/>
+                  </w:pPr>
+                  <w:r>
+                    <w:rPr>
+                      <w:rStyle w:val="VerbatimChar"/>
+                    </w:rPr>
+                    <w:t xml:space="preserve">/ars-rebuttal-audit</w:t>
+                  </w:r>
+                </w:p>
+              </w:tc>
+              <w:tc>
+                <w:tcPr/>
+                <w:p>
+                  <w:pPr>
+                    <w:pStyle w:val="Compact"/>
+                    <w:jc w:val="left"/>
+                    <w:jc w:val="center"/>
+                  </w:pPr>
+                  <w:r>
+                    <w:rPr>
+                      <w:rFonts w:hint="eastAsia"/>
+                    </w:rPr>
+                    <w:t xml:space="preserve">写作</w:t>
+                  </w:r>
+                </w:p>
+              </w:tc>
+              <w:tc>
+                <w:tcPr/>
+                <w:p>
+                  <w:pPr>
+                    <w:pStyle w:val="Compact"/>
+                    <w:jc w:val="left"/>
+                    <w:jc w:val="center"/>
+                  </w:pPr>
+                  <w:r>
+                    <w:rPr>
+                      <w:rFonts w:hint="eastAsia"/>
+                    </w:rPr>
+                    <w:t xml:space="preserve">审计审稿意见回复稿的覆盖度、语气和证据链</w:t>
+                  </w:r>
+                </w:p>
+              </w:tc>
+              <w:tc>
+                <w:tcPr/>
+                <w:p>
+                  <w:pPr>
+                    <w:pStyle w:val="Compact"/>
+                    <w:jc w:val="left"/>
+                    <w:jc w:val="center"/>
+                  </w:pPr>
+                  <w:r>
+                    <w:rPr>
+                      <w:rStyle w:val="VerbatimChar"/>
+                    </w:rPr>
+                    <w:t xml:space="preserve">ars-academic-paper</w:t>
+                  </w:r>
+                </w:p>
+              </w:tc>
+              <w:tc>
+                <w:tcPr/>
+                <w:p>
+                  <w:pPr>
+                    <w:pStyle w:val="Compact"/>
+                    <w:jc w:val="left"/>
+                    <w:jc w:val="center"/>
+                  </w:pPr>
+                  <w:r>
+                    <w:rPr>
+                      <w:rStyle w:val="VerbatimChar"/>
+                    </w:rPr>
+                    <w:t xml:space="preserve">/ars-rebuttal-audit</w:t>
+                  </w:r>
+                  <w:r>
+                    <w:t xml:space="preserve"> </w:t>
+                  </w:r>
+                  <w:r>
+                    <w:t xml:space="preserve">→</w:t>
+                  </w:r>
+                  <w:r>
+                    <w:t xml:space="preserve"> </w:t>
+                  </w:r>
+                  <w:r>
+                    <w:rPr>
+                      <w:rFonts w:hint="eastAsia"/>
+                    </w:rPr>
+                    <w:t xml:space="preserve">“请审计我写的这份response</w:t>
+                  </w:r>
+                  <w:r>
+                    <w:t xml:space="preserve"> </w:t>
+                  </w:r>
+                  <w:r>
+                    <w:rPr>
+                      <w:rFonts w:hint="eastAsia"/>
+                    </w:rPr>
+                    <w:t xml:space="preserve">letter是否完整覆盖了审稿人的所有意见”</w:t>
+                  </w:r>
+                </w:p>
+              </w:tc>
+            </w:tr>
+            <w:tr>
+              <w:tc>
+                <w:tcPr/>
+                <w:p>
+                  <w:pPr>
+                    <w:pStyle w:val="Compact"/>
+                    <w:jc w:val="left"/>
+                    <w:jc w:val="center"/>
+                  </w:pPr>
+                  <w:r>
+                    <w:rPr>
+                      <w:rStyle w:val="VerbatimChar"/>
+                    </w:rPr>
+                    <w:t xml:space="preserve">/ars-revision-coach</w:t>
+                  </w:r>
+                </w:p>
+              </w:tc>
+              <w:tc>
+                <w:tcPr/>
+                <w:p>
+                  <w:pPr>
+                    <w:pStyle w:val="Compact"/>
+                    <w:jc w:val="left"/>
+                    <w:jc w:val="center"/>
+                  </w:pPr>
+                  <w:r>
+                    <w:rPr>
+                      <w:rFonts w:hint="eastAsia"/>
+                    </w:rPr>
+                    <w:t xml:space="preserve">写作</w:t>
+                  </w:r>
+                </w:p>
+              </w:tc>
+              <w:tc>
+                <w:tcPr/>
+                <w:p>
+                  <w:pPr>
+                    <w:pStyle w:val="Compact"/>
+                    <w:jc w:val="left"/>
+                    <w:jc w:val="center"/>
+                  </w:pPr>
+                  <w:r>
+                    <w:rPr>
+                      <w:rFonts w:hint="eastAsia"/>
+                    </w:rPr>
+                    <w:t xml:space="preserve">解析审稿意见并生成结构化的修改路线图</w:t>
+                  </w:r>
+                </w:p>
+              </w:tc>
+              <w:tc>
+                <w:tcPr/>
+                <w:p>
+                  <w:pPr>
+                    <w:pStyle w:val="Compact"/>
+                    <w:jc w:val="left"/>
+                    <w:jc w:val="center"/>
+                  </w:pPr>
+                  <w:r>
+                    <w:rPr>
+                      <w:rStyle w:val="VerbatimChar"/>
+                    </w:rPr>
+                    <w:t xml:space="preserve">ars-academic-paper</w:t>
+                  </w:r>
+                </w:p>
+              </w:tc>
+              <w:tc>
+                <w:tcPr/>
+                <w:p>
+                  <w:pPr>
+                    <w:pStyle w:val="Compact"/>
+                    <w:jc w:val="left"/>
+                    <w:jc w:val="center"/>
+                  </w:pPr>
+                  <w:r>
+                    <w:rPr>
+                      <w:rStyle w:val="VerbatimChar"/>
+                    </w:rPr>
+                    <w:t xml:space="preserve">/ars-revision-coach</w:t>
+                  </w:r>
+                  <w:r>
+                    <w:t xml:space="preserve"> </w:t>
+                  </w:r>
+                  <w:r>
+                    <w:t xml:space="preserve">→</w:t>
+                  </w:r>
+                  <w:r>
+                    <w:t xml:space="preserve"> </w:t>
+                  </w:r>
+                  <w:r>
+                    <w:rPr>
+                      <w:rFonts w:hint="eastAsia"/>
+                    </w:rPr>
+                    <w:t xml:space="preserve">“帮我分析这3条审稿意见，制定修改策略”</w:t>
+                  </w:r>
+                </w:p>
+              </w:tc>
+            </w:tr>
+            <w:tr>
+              <w:tc>
+                <w:tcPr/>
+                <w:p>
+                  <w:pPr>
+                    <w:pStyle w:val="Compact"/>
+                    <w:jc w:val="left"/>
+                    <w:jc w:val="center"/>
+                  </w:pPr>
+                  <w:r>
+                    <w:rPr>
+                      <w:rStyle w:val="VerbatimChar"/>
+                    </w:rPr>
+                    <w:t xml:space="preserve">/ars-mark-read</w:t>
+                  </w:r>
+                </w:p>
+              </w:tc>
+              <w:tc>
+                <w:tcPr/>
+                <w:p>
+                  <w:pPr>
+                    <w:pStyle w:val="Compact"/>
+                    <w:jc w:val="left"/>
+                    <w:jc w:val="center"/>
+                  </w:pPr>
+                  <w:r>
+                    <w:rPr>
+                      <w:rFonts w:hint="eastAsia"/>
+                    </w:rPr>
+                    <w:t xml:space="preserve">实用工具</w:t>
+                  </w:r>
+                </w:p>
+              </w:tc>
+              <w:tc>
+                <w:tcPr/>
+                <w:p>
+                  <w:pPr>
+                    <w:pStyle w:val="Compact"/>
+                    <w:jc w:val="left"/>
+                    <w:jc w:val="center"/>
+                  </w:pPr>
+                  <w:r>
+                    <w:rPr>
+                      <w:rFonts w:hint="eastAsia"/>
+                    </w:rPr>
+                    <w:t xml:space="preserve">将验证报告的</w:t>
+                  </w:r>
+                  <w:r>
+                    <w:t xml:space="preserve"> advisory </w:t>
+                  </w:r>
+                  <w:r>
+                    <w:rPr>
+                      <w:rFonts w:hint="eastAsia"/>
+                    </w:rPr>
+                    <w:t xml:space="preserve">发现标记为”已读/已接受”</w:t>
+                  </w:r>
+                </w:p>
+              </w:tc>
+              <w:tc>
+                <w:tcPr/>
+                <w:p>
+                  <w:pPr>
+                    <w:pStyle w:val="Compact"/>
+                    <w:jc w:val="left"/>
+                    <w:jc w:val="center"/>
+                  </w:pPr>
+                  <w:r>
+                    <w:rPr>
+                      <w:rStyle w:val="VerbatimChar"/>
+                    </w:rPr>
+                    <w:t xml:space="preserve">ars-deep-research</w:t>
+                  </w:r>
+                </w:p>
+              </w:tc>
+              <w:tc>
+                <w:tcPr/>
+                <w:p>
+                  <w:pPr>
+                    <w:pStyle w:val="Compact"/>
+                    <w:jc w:val="left"/>
+                    <w:jc w:val="center"/>
+                  </w:pPr>
+                  <w:r>
+                    <w:rPr>
+                      <w:rStyle w:val="VerbatimChar"/>
+                    </w:rPr>
+                    <w:t xml:space="preserve">/ars-mark-read</w:t>
+                  </w:r>
+                  <w:r>
+                    <w:t xml:space="preserve"> </w:t>
+                  </w:r>
+                  <w:r>
+                    <w:t xml:space="preserve">→</w:t>
+                  </w:r>
+                  <w:r>
+                    <w:t xml:space="preserve"> </w:t>
+                  </w:r>
+                  <w:r>
+                    <w:rPr>
+                      <w:rFonts w:hint="eastAsia"/>
+                    </w:rPr>
+                    <w:t xml:space="preserve">“标记</w:t>
+                  </w:r>
+                  <w:r>
+                    <w:t xml:space="preserve"> issue #42 </w:t>
+                  </w:r>
+                  <w:r>
+                    <w:rPr>
+                      <w:rFonts w:hint="eastAsia"/>
+                    </w:rPr>
+                    <w:t xml:space="preserve">为已知问题，不再阻塞管线”</w:t>
+                  </w:r>
+                </w:p>
+              </w:tc>
+            </w:tr>
+            <w:tr>
+              <w:tc>
+                <w:tcPr/>
+                <w:p>
+                  <w:pPr>
+                    <w:pStyle w:val="Compact"/>
+                    <w:jc w:val="left"/>
+                    <w:jc w:val="center"/>
+                  </w:pPr>
+                  <w:r>
+                    <w:rPr>
+                      <w:rStyle w:val="VerbatimChar"/>
+                    </w:rPr>
+                    <w:t xml:space="preserve">/ars-unmark-read</w:t>
+                  </w:r>
+                </w:p>
+              </w:tc>
+              <w:tc>
+                <w:tcPr/>
+                <w:p>
+                  <w:pPr>
+                    <w:pStyle w:val="Compact"/>
+                    <w:jc w:val="left"/>
+                    <w:jc w:val="center"/>
+                  </w:pPr>
+                  <w:r>
+                    <w:rPr>
+                      <w:rFonts w:hint="eastAsia"/>
+                    </w:rPr>
+                    <w:t xml:space="preserve">实用工具</w:t>
+                  </w:r>
+                </w:p>
+              </w:tc>
+              <w:tc>
+                <w:tcPr/>
+                <w:p>
+                  <w:pPr>
+                    <w:pStyle w:val="Compact"/>
+                    <w:jc w:val="left"/>
+                    <w:jc w:val="center"/>
+                  </w:pPr>
+                  <w:r>
+                    <w:rPr>
+                      <w:rFonts w:hint="eastAsia"/>
+                    </w:rPr>
+                    <w:t xml:space="preserve">取消”已读”标记，重新触发验证检查</w:t>
+                  </w:r>
+                </w:p>
+              </w:tc>
+              <w:tc>
+                <w:tcPr/>
+                <w:p>
+                  <w:pPr>
+                    <w:pStyle w:val="Compact"/>
+                    <w:jc w:val="left"/>
+                    <w:jc w:val="center"/>
+                  </w:pPr>
+                  <w:r>
+                    <w:rPr>
+                      <w:rStyle w:val="VerbatimChar"/>
+                    </w:rPr>
+                    <w:t xml:space="preserve">ars-deep-research</w:t>
+                  </w:r>
+                </w:p>
+              </w:tc>
+              <w:tc>
+                <w:tcPr/>
+                <w:p>
+                  <w:pPr>
+                    <w:pStyle w:val="Compact"/>
+                    <w:jc w:val="left"/>
+                    <w:jc w:val="center"/>
+                  </w:pPr>
+                  <w:r>
+                    <w:rPr>
+                      <w:rStyle w:val="VerbatimChar"/>
+                    </w:rPr>
+                    <w:t xml:space="preserve">/ars-unmark-read</w:t>
+                  </w:r>
+                  <w:r>
+                    <w:t xml:space="preserve"> </w:t>
+                  </w:r>
+                  <w:r>
+                    <w:t xml:space="preserve">→</w:t>
+                  </w:r>
+                  <w:r>
+                    <w:t xml:space="preserve"> </w:t>
+                  </w:r>
+                  <w:r>
+                    <w:rPr>
+                      <w:rFonts w:hint="eastAsia"/>
+                    </w:rPr>
+                    <w:t xml:space="preserve">“取消标记</w:t>
+                  </w:r>
+                  <w:r>
+                    <w:t xml:space="preserve"> issue </w:t>
+                  </w:r>
+                  <w:r>
+                    <w:rPr>
+                      <w:rFonts w:hint="eastAsia"/>
+                    </w:rPr>
+                    <w:t xml:space="preserve">#42，重新验证”</w:t>
+                  </w:r>
+                </w:p>
+              </w:tc>
+            </w:tr>
+            <w:tr>
+              <w:tc>
+                <w:tcPr/>
+                <w:p>
+                  <w:pPr>
+                    <w:pStyle w:val="Compact"/>
+                    <w:jc w:val="left"/>
+                    <w:jc w:val="center"/>
+                  </w:pPr>
+                  <w:r>
+                    <w:rPr>
+                      <w:rStyle w:val="VerbatimChar"/>
+                    </w:rPr>
+                    <w:t xml:space="preserve">/ars-cache-invalidate</w:t>
+                  </w:r>
+                </w:p>
+              </w:tc>
+              <w:tc>
+                <w:tcPr/>
+                <w:p>
+                  <w:pPr>
+                    <w:pStyle w:val="Compact"/>
+                    <w:jc w:val="left"/>
+                    <w:jc w:val="center"/>
+                  </w:pPr>
+                  <w:r>
+                    <w:rPr>
+                      <w:rFonts w:hint="eastAsia"/>
+                    </w:rPr>
+                    <w:t xml:space="preserve">实用工具</w:t>
+                  </w:r>
+                </w:p>
+              </w:tc>
+              <w:tc>
+                <w:tcPr/>
+                <w:p>
+                  <w:pPr>
+                    <w:pStyle w:val="Compact"/>
+                    <w:jc w:val="left"/>
+                    <w:jc w:val="center"/>
+                  </w:pPr>
+                  <w:r>
+                    <w:rPr>
+                      <w:rFonts w:hint="eastAsia"/>
+                    </w:rPr>
+                    <w:t xml:space="preserve">清除</w:t>
+                  </w:r>
+                  <w:r>
+                    <w:t xml:space="preserve"> ARS </w:t>
+                  </w:r>
+                  <w:r>
+                    <w:rPr>
+                      <w:rFonts w:hint="eastAsia"/>
+                    </w:rPr>
+                    <w:t xml:space="preserve">验证缓存（SQLite</w:t>
+                  </w:r>
+                  <w:r>
+                    <w:t xml:space="preserve"> </w:t>
+                  </w:r>
+                  <w:r>
+                    <w:rPr>
+                      <w:rFonts w:hint="eastAsia"/>
+                    </w:rPr>
+                    <w:t xml:space="preserve">数据库）</w:t>
+                  </w:r>
+                </w:p>
+              </w:tc>
+              <w:tc>
+                <w:tcPr/>
+                <w:p>
+                  <w:pPr>
+                    <w:pStyle w:val="Compact"/>
+                    <w:jc w:val="left"/>
+                    <w:jc w:val="center"/>
+                  </w:pPr>
+                  <w:r>
+                    <w:rPr>
+                      <w:rStyle w:val="VerbatimChar"/>
+                    </w:rPr>
+                    <w:t xml:space="preserve">ars-meta</w:t>
+                  </w:r>
+                </w:p>
+              </w:tc>
+              <w:tc>
+                <w:tcPr/>
+                <w:p>
+                  <w:pPr>
+                    <w:pStyle w:val="Compact"/>
+                    <w:jc w:val="left"/>
+                    <w:jc w:val="center"/>
+                  </w:pPr>
+                  <w:r>
+                    <w:rPr>
+                      <w:rStyle w:val="VerbatimChar"/>
+                    </w:rPr>
+                    <w:t xml:space="preserve">/ars-cache-invalidate</w:t>
+                  </w:r>
+                  <w:r>
+                    <w:t xml:space="preserve"> </w:t>
+                  </w:r>
+                  <w:r>
+                    <w:t xml:space="preserve">→</w:t>
+                  </w:r>
+                  <w:r>
+                    <w:t xml:space="preserve"> </w:t>
+                  </w:r>
+                  <w:r>
+                    <w:rPr>
+                      <w:rFonts w:hint="eastAsia"/>
+                    </w:rPr>
+                    <w:t xml:space="preserve">“清除所有验证缓存，重新运行完整验证”</w:t>
+                  </w:r>
+                </w:p>
+              </w:tc>
+            </w:tr>
           </w:tbl>
           <w:bookmarkEnd w:id="19"/>
           <w:p/>
@@ -3278,13 +3914,28 @@
         <w:t xml:space="preserve">），且未提供具体使用示例。本版本已补全全部</w:t>
       </w:r>
       <w:r>
-        <w:t xml:space="preserve"> 13 </w:t>
-      </w:r>
-      <w:r>
-        <w:rPr>
-          <w:rFonts w:hint="eastAsia"/>
-        </w:rPr>
-        <w:t xml:space="preserve">条，并每一条配有真实使用场景。</w:t>
+        <w:t xml:space="preserve"> </w:t>
+      </w:r>
+      <w:r>
+        <w:rPr>
+          <w:b/>
+          <w:bCs/>
+        </w:rPr>
+        <w:t xml:space="preserve">19 </w:t>
+      </w:r>
+      <w:r>
+        <w:rPr>
+          <w:rFonts w:hint="eastAsia"/>
+          <w:b/>
+          <w:bCs/>
+        </w:rPr>
+        <w:t xml:space="preserve">条</w:t>
+      </w:r>
+      <w:r>
+        <w:rPr>
+          <w:rFonts w:hint="eastAsia"/>
+        </w:rPr>
+        <w:t xml:space="preserve">，并每一条配有真实使用场景。</w:t>
       </w:r>
     </w:p>
     <w:bookmarkEnd w:id="20"/>
@@ -3345,7 +3996,7 @@
           <w:b/>
           <w:bCs/>
         </w:rPr>
-        <w:t xml:space="preserve">25 </w:t>
+        <w:t xml:space="preserve">27 </w:t>
       </w:r>
       <w:r>
         <w:rPr>
@@ -3644,7 +4295,7 @@
       </w:r>
     </w:p>
     <w:bookmarkEnd w:id="21"/>
-    <w:bookmarkStart w:id="22" w:name="ars-deep-research-深度研究7-种模式"/>
+    <w:bookmarkStart w:id="22" w:name="ars-deep-research-深度研究8-种模式"/>
     <w:p>
       <w:pPr>
         <w:pStyle w:val="Heading2"/>
@@ -3656,7 +4307,7 @@
         <w:rPr>
           <w:rFonts w:hint="eastAsia"/>
         </w:rPr>
-        <w:t xml:space="preserve">深度研究（7</w:t>
+        <w:t xml:space="preserve">深度研究（8</w:t>
       </w:r>
       <w:r>
         <w:t xml:space="preserve"> </w:t>
@@ -4271,9 +4922,74 @@
           </w:p>
         </w:tc>
       </w:tr>
+      <w:tr>
+        <w:tc>
+          <w:tcPr/>
+          <w:p>
+            <w:pPr>
+              <w:pStyle w:val="Compact"/>
+              <w:jc w:val="left"/>
+            </w:pPr>
+            <w:r>
+              <w:rPr>
+                <w:rStyle w:val="VerbatimChar"/>
+              </w:rPr>
+              <w:t xml:space="preserve">three-way-scan</w:t>
+            </w:r>
+          </w:p>
+        </w:tc>
+        <w:tc>
+          <w:tcPr/>
+          <w:p>
+            <w:pPr>
+              <w:pStyle w:val="Compact"/>
+              <w:jc w:val="left"/>
+            </w:pPr>
+            <w:r>
+              <w:rPr>
+                <w:rFonts w:hint="eastAsia"/>
+              </w:rPr>
+              <w:t xml:space="preserve">三方扫描</w:t>
+            </w:r>
+          </w:p>
+        </w:tc>
+        <w:tc>
+          <w:tcPr/>
+          <w:p>
+            <w:pPr>
+              <w:pStyle w:val="Compact"/>
+              <w:jc w:val="left"/>
+            </w:pPr>
+            <w:r>
+              <w:t xml:space="preserve">WHY/HOW/WHAT </w:t>
+            </w:r>
+            <w:r>
+              <w:rPr>
+                <w:rFonts w:hint="eastAsia"/>
+              </w:rPr>
+              <w:t xml:space="preserve">三方框架快速定位研究空白</w:t>
+            </w:r>
+          </w:p>
+        </w:tc>
+        <w:tc>
+          <w:tcPr/>
+          <w:p>
+            <w:pPr>
+              <w:pStyle w:val="Compact"/>
+              <w:jc w:val="left"/>
+            </w:pPr>
+            <w:r>
+              <w:rPr>
+                <w:rFonts w:hint="eastAsia"/>
+              </w:rPr>
+              <w:t xml:space="preserve">开题前梳理研究空白</w:t>
+            </w:r>
+          </w:p>
+        </w:tc>
+      </w:tr>
     </w:tbl>
     <w:bookmarkEnd w:id="22"/>
-    <w:bookmarkStart w:id="23" w:name="ars-academic-paper-学术论文10-种模式"/>
+    <w:bookmarkStart w:id="23" w:name="ars-academic-paper-学术论文11-种模式"/>
     <w:p>
       <w:pPr>
         <w:pStyle w:val="Heading2"/>
@@ -4285,7 +5001,7 @@
         <w:rPr>
           <w:rFonts w:hint="eastAsia"/>
         </w:rPr>
-        <w:t xml:space="preserve">学术论文（10</w:t>
+        <w:t xml:space="preserve">学术论文（11</w:t>
       </w:r>
       <w:r>
         <w:t xml:space="preserve"> </w:t>
@@ -5086,6 +5802,68 @@
           </w:p>
         </w:tc>
       </w:tr>
+      <w:tr>
+        <w:tc>
+          <w:tcPr/>
+          <w:p>
+            <w:pPr>
+              <w:pStyle w:val="Compact"/>
+              <w:jc w:val="left"/>
+            </w:pPr>
+            <w:r>
+              <w:rPr>
+                <w:rStyle w:val="VerbatimChar"/>
+              </w:rPr>
+              <w:t xml:space="preserve">rebuttal-audit</w:t>
+            </w:r>
+          </w:p>
+        </w:tc>
+        <w:tc>
+          <w:tcPr/>
+          <w:p>
+            <w:pPr>
+              <w:pStyle w:val="Compact"/>
+              <w:jc w:val="left"/>
+            </w:pPr>
+            <w:r>
+              <w:rPr>
+                <w:rFonts w:hint="eastAsia"/>
+              </w:rPr>
+              <w:t xml:space="preserve">回复审计</w:t>
+            </w:r>
+          </w:p>
+        </w:tc>
+        <w:tc>
+          <w:tcPr/>
+          <w:p>
+            <w:pPr>
+              <w:pStyle w:val="Compact"/>
+              <w:jc w:val="left"/>
+            </w:pPr>
+            <w:r>
+              <w:rPr>
+                <w:rFonts w:hint="eastAsia"/>
+              </w:rPr>
+              <w:t xml:space="preserve">审计审稿意见回复稿的覆盖度、语气和证据链</w:t>
+            </w:r>
+          </w:p>
+        </w:tc>
+        <w:tc>
+          <w:tcPr/>
+          <w:p>
+            <w:pPr>
+              <w:pStyle w:val="Compact"/>
+              <w:jc w:val="left"/>
+            </w:pPr>
+            <w:r>
+              <w:rPr>
+                <w:rFonts w:hint="eastAsia"/>
+              </w:rPr>
+              <w:t xml:space="preserve">提交回复前最终检查</w:t>
+            </w:r>
+          </w:p>
+        </w:tc>
+      </w:tr>
     </w:tbl>
     <w:bookmarkEnd w:id="23"/>
     <w:bookmarkStart w:id="24" w:name="ars-reviewer-同行评审6-种模式"/>
@@ -7626,7 +8404,7 @@
         <w:rPr>
           <w:rStyle w:val="VerbatimChar"/>
         </w:rPr>
-        <w:t xml:space="preserve">commands</w:t>
+        <w:t xml:space="preserve">command</w:t>
       </w:r>
       <w:r>
         <w:t xml:space="preserve"> </w:t>
@@ -7638,7 +8416,7 @@
         <w:t xml:space="preserve">部分是否正确配置了</w:t>
       </w:r>
       <w:r>
-        <w:t xml:space="preserve"> 13 </w:t>
+        <w:t xml:space="preserve"> 19 </w:t>
       </w:r>
       <w:r>
         <w:rPr>
@@ -7775,7 +8553,7 @@
         <w:rPr>
           <w:rFonts w:hint="eastAsia"/>
         </w:rPr>
-        <w:t xml:space="preserve">v3.9.4.2。差异仅在于调度层：CC</w:t>
+        <w:t xml:space="preserve">v3.12.1。差异仅在于调度层：CC</w:t>
       </w:r>
       <w:r>
         <w:t xml:space="preserve"> </w:t>
@@ -7982,7 +8760,7 @@
         <w:t xml:space="preserve">中定义的</w:t>
       </w:r>
       <w:r>
-        <w:t xml:space="preserve"> 13 </w:t>
+        <w:t xml:space="preserve"> 19 </w:t>
       </w:r>
       <w:r>
         <w:rPr>
@@ -8015,7 +8793,7 @@
         <w:rPr>
           <w:rFonts w:hint="eastAsia"/>
         </w:rPr>
-        <w:t xml:space="preserve">中全部列出（13/13</w:t>
+        <w:t xml:space="preserve">中全部列出（19/19</w:t>
       </w:r>
       <w:r>
         <w:t xml:space="preserve"> </w:t>
@@ -8130,7 +8908,7 @@
         <w:t xml:space="preserve">中的</w:t>
       </w:r>
       <w:r>
-        <w:t xml:space="preserve"> 25 </w:t>
+        <w:t xml:space="preserve"> 27 </w:t>
       </w:r>
       <w:r>
         <w:rPr>
@@ -8145,7 +8923,7 @@
         <w:rPr>
           <w:rFonts w:hint="eastAsia"/>
         </w:rPr>
-        <w:t xml:space="preserve">章按技能分类列出（7+10+6+1+1=25），无遗漏</w:t>
+        <w:t xml:space="preserve">章按技能分类列出（8+11+6+1+1=27），无遗漏</w:t>
       </w:r>
     </w:p>
     <w:p>
@@ -8168,7 +8946,7 @@
         <w:rPr>
           <w:rFonts w:hint="eastAsia"/>
         </w:rPr>
-        <w:t xml:space="preserve">：13</w:t>
+        <w:t xml:space="preserve">：19</w:t>
       </w:r>
       <w:r>
         <w:t xml:space="preserve"> </w:t>
@@ -8200,7 +8978,7 @@
         <w:rPr>
           <w:rFonts w:hint="eastAsia"/>
         </w:rPr>
-        <w:t xml:space="preserve">：全文”13</w:t>
+        <w:t xml:space="preserve">：全文”19</w:t>
       </w:r>
       <w:r>
         <w:t xml:space="preserve"> </w:t>
@@ -8224,7 +9002,7 @@
         <w:t xml:space="preserve">、</w:t>
       </w:r>
       <w:r>
-        <w:t xml:space="preserve">“25 </w:t>
+        <w:t xml:space="preserve">“27 </w:t>
       </w:r>
       <w:r>
         <w:rPr>

</xml_diff>